<commit_message>
fix(luan-an): align AI declaration with CTU LATS regulation (remove; keep Loi cam doan)
Per CTU dissertation presentation guide (huong_dan_viet_trinh_bay_LATS_A5_CTU_v2.pdf, 63 pp.), the
front matter is: title -> Loi cam doan (Appendix 10) -> acknowledgements -> abstract -> ...; it does
NOT contain or require an AI-use declaration section. The canonical source (thesis/00_phan_dau_vi.md)
already follows this; the AI/Grammarly declaration lingered only in the dist build copy. Re-synced
dist from the clean canonical and rebuilt 00_phan_dau_vi.docx: no AI declaration, LOI CAM DOAN kept.
Updated LIEM_CHINH_KHOA_HOC_compliance.md (Art.16 row, remaining-tasks, conclusion) to record the
CTU basis and note the author may re-add an AI note if a committee invokes MOST Art.16.
</commit_message>
<xml_diff>
--- a/dist/luan_an_ctu/00_phan_dau_vi.docx
+++ b/dist/luan_an_ctu/00_phan_dau_vi.docx
@@ -30,7 +30,7 @@
         <w:t xml:space="preserve">─────────────────────────────────────────</w:t>
       </w:r>
     </w:p>
-    <w:bookmarkStart w:id="31" w:name="đỗ-thùy-hương"/>
+    <w:bookmarkStart w:id="30" w:name="đỗ-thùy-hương"/>
     <w:p>
       <w:pPr>
         <w:pStyle w:val="Heading1"/>
@@ -57,7 +57,7 @@
           <w:iCs/>
           <w:i/>
         </w:rPr>
-        <w:t xml:space="preserve">(Tiêu đề dự thảo, NCS xác nhận tiêu đề chính thức đã đăng ký với cơ sở đào tạo)</w:t>
+        <w:t xml:space="preserve">(Tiêu đề dự thảo — NCS xác nhận tiêu đề chính thức đã đăng ký với cơ sở đào tạo)</w:t>
       </w:r>
     </w:p>
     <w:p>
@@ -195,25 +195,7 @@
       </w:r>
     </w:p>
     <w:bookmarkEnd w:id="21"/>
-    <w:bookmarkStart w:id="22" w:name="tuyên-bố-về-sử-dụng-trí-tuệ-nhân-tạo"/>
-    <w:p>
-      <w:pPr>
-        <w:pStyle w:val="Heading2"/>
-      </w:pPr>
-      <w:r>
-        <w:t xml:space="preserve">TUYÊN BỐ VỀ SỬ DỤNG TRÍ TUỆ NHÂN TẠO</w:t>
-      </w:r>
-    </w:p>
-    <w:p>
-      <w:pPr>
-        <w:pStyle w:val="FirstParagraph"/>
-      </w:pPr>
-      <w:r>
-        <w:t xml:space="preserve">Trong quá trình thực hiện luận án, tác giả có sử dụng công cụ hỗ trợ viết Grammarly (dịch vụ trực tuyến, truy cập trong giai đoạn 2025–2026) với phạm vi duy nhất là rà soát chính tả, ngữ pháp và dấu câu cho phần văn bản do chính tác giả viết. Không có nội dung khoa học, ý tưởng, dữ liệu, kết quả phân tích hay diễn giải nào được tạo ra hoàn toàn bởi trí tuệ nhân tạo. Tác giả không sử dụng trí tuệ nhân tạo để tạo dữ liệu, hình ảnh hay tài liệu tham khảo. Trí tuệ nhân tạo chỉ đóng vai trò công cụ hỗ trợ; tác giả chịu trách nhiệm cuối cùng và hoàn toàn về toàn bộ nội dung của luận án. (Tuân thủ Điều 16, Hướng dẫn về liêm chính khoa học và đạo đức nghề nghiệp trong nghiên cứu khoa học và phát triển công nghệ ban hành kèm theo Quyết định của Bộ trưởng Bộ Khoa học và Công nghệ.)</w:t>
-      </w:r>
-    </w:p>
-    <w:bookmarkEnd w:id="22"/>
-    <w:bookmarkStart w:id="23" w:name="lời-cảm-ơn"/>
+    <w:bookmarkStart w:id="22" w:name="lời-cảm-ơn"/>
     <w:p>
       <w:pPr>
         <w:pStyle w:val="Heading2"/>
@@ -241,8 +223,8 @@
         </w:pict>
       </w:r>
     </w:p>
-    <w:bookmarkEnd w:id="23"/>
-    <w:bookmarkStart w:id="24" w:name="tóm-tắt"/>
+    <w:bookmarkEnd w:id="22"/>
+    <w:bookmarkStart w:id="23" w:name="tóm-tắt"/>
     <w:p>
       <w:pPr>
         <w:pStyle w:val="Heading2"/>
@@ -256,7 +238,7 @@
         <w:pStyle w:val="FirstParagraph"/>
       </w:pPr>
       <w:r>
-        <w:t xml:space="preserve">Luận án nghiên cứu mối quan hệ giữa quốc tế hóa và hiệu quả hoạt động của doanh nghiệp (internationalization–firm performance, I–P) tại châu Á, tập trung làm rõ các điều kiện biên giải thích sự dị biệt cao trong mối quan hệ này. Trên cơ sở tích hợp bốn lý thuyết kinh điển, mô hình Uppsala, lý thuyết dựa trên nguồn lực (RBV), lý thuyết thể chế và lý thuyết thượng tầng quản trị, cùng lớp mở rộng về năng lực số, luận án xây dựng khung giải thích đa tầng CDCM (Country–Digital–Capability Moderation) với ba tầng điều tiết: bối cảnh thể chế (vận hành hóa bằng khung phân loại ICRV sáu nhóm), năng lực số (phân tách năng lực công nghệ TCI và chỉ số chấp nhận số DAI), và đặc điểm nhà quản trị cấp cao.</w:t>
+        <w:t xml:space="preserve">Luận án nghiên cứu mối quan hệ giữa quốc tế hóa và hiệu quả hoạt động của doanh nghiệp (internationalization–firm performance, I–P) tại châu Á, tập trung làm rõ các điều kiện biên giải thích sự dị biệt cao trong mối quan hệ này. Trên cơ sở tích hợp bốn lý thuyết kinh điển — mô hình Uppsala, lý thuyết dựa trên nguồn lực (RBV), lý thuyết thể chế và lý thuyết thượng tầng quản trị — cùng lớp mở rộng về năng lực số, luận án xây dựng khung giải thích đa tầng CDCM (Country–Digital–Capability Moderation) với ba tầng điều tiết: bối cảnh thể chế (vận hành hóa bằng khung phân loại ICRV sáu nhóm), năng lực số (phân tách năng lực công nghệ TCI và chỉ số chấp nhận số DAI), và đặc điểm nhà quản trị cấp cao.</w:t>
       </w:r>
     </w:p>
     <w:p>
@@ -272,7 +254,7 @@
         <w:pStyle w:val="BodyText"/>
       </w:pPr>
       <w:r>
-        <w:t xml:space="preserve">Kết quả chính: (1) quan hệ I–P có dạng phi tuyến chữ U ngược, nhưng điểm uốn (turning point) không cố định mà giảm dần theo chất lượng thể chế, từ khoảng 55% cường độ xuất khẩu ở các nền kinh tế thể chế yếu xuống khoảng 28% ở các nền kinh tế thể chế mạnh; (2) TCI là năng lực nền tảng nâng mặt bằng hiệu quả phổ quát, trong khi DAI là nguồn lực tình huống làm thay đổi độ cong đường quan hệ và phát huy mạnh hơn ở môi trường thể chế yếu (hiệu ứng "lá chắn số"); (3) tại nhóm SIDS, quan hệ I–P chuyển thành âm đơn điệu không có điểm uốn, hiện tượng được luận án đặt tên là</w:t>
+        <w:t xml:space="preserve">Kết quả chính: (1) quan hệ I–P có dạng phi tuyến chữ U ngược, nhưng điểm uốn (turning point) không cố định mà giảm dần theo chất lượng thể chế — từ khoảng 55% cường độ xuất khẩu ở các nền kinh tế thể chế yếu xuống khoảng 28% ở các nền kinh tế thể chế mạnh; (2) TCI là năng lực nền tảng nâng mặt bằng hiệu quả phổ quát, trong khi DAI là nguồn lực tình huống làm thay đổi độ cong đường quan hệ và phát huy mạnh hơn ở môi trường thể chế yếu (hiệu ứng "lá chắn số"); (3) tại nhóm SIDS, quan hệ I–P chuyển thành âm đơn điệu không có điểm uốn — hiện tượng được luận án đặt tên là</w:t>
       </w:r>
       <w:r>
         <w:t xml:space="preserve"> </w:t>
@@ -313,8 +295,8 @@
         </w:pict>
       </w:r>
     </w:p>
-    <w:bookmarkEnd w:id="24"/>
-    <w:bookmarkStart w:id="25" w:name="abstract"/>
+    <w:bookmarkEnd w:id="23"/>
+    <w:bookmarkStart w:id="24" w:name="abstract"/>
     <w:p>
       <w:pPr>
         <w:pStyle w:val="Heading2"/>
@@ -328,7 +310,7 @@
         <w:pStyle w:val="FirstParagraph"/>
       </w:pPr>
       <w:r>
-        <w:t xml:space="preserve">This dissertation examines the internationalization–firm performance (I–P) relationship across Asia, focusing on the boundary conditions that explain its well-documented heterogeneity. Integrating four foundational theories, the Uppsala model, the resource-based view (RBV), institutional theory, and upper echelons theory, with a digital-capability extension, the dissertation develops a multi-tier moderation framework, CDCM (Country–Digital–Capability Moderation), comprising three moderating tiers: institutional context (operationalized through a six-group ICRV taxonomy), digital capability (separating technological capability, TCI, from digital adoption, DAI), and top-manager characteristics.</w:t>
+        <w:t xml:space="preserve">This dissertation examines the internationalization–firm performance (I–P) relationship across Asia, focusing on the boundary conditions that explain its well-documented heterogeneity. Integrating four foundational theories — the Uppsala model, the resource-based view (RBV), institutional theory, and upper echelons theory — with a digital-capability extension, the dissertation develops a multi-tier moderation framework, CDCM (Country–Digital–Capability Moderation), comprising three moderating tiers: institutional context (operationalized through a six-group ICRV taxonomy), digital capability (separating technological capability, TCI, from digital adoption, DAI), and top-manager characteristics.</w:t>
       </w:r>
     </w:p>
     <w:p>
@@ -336,7 +318,7 @@
         <w:pStyle w:val="BodyText"/>
       </w:pPr>
       <w:r>
-        <w:t xml:space="preserve">The study adopts a mixed synthesis-empirical design: (i) a three-level meta-analysis spanning 1982–2026 (k = 238 studies); and (ii) firm-level empirical analysis of World Bank Enterprise Survey (WBES) microdata across 49 Asian and Pacific economies (main analytic sample N = 91, 982 firms), complemented by country-specific analyses (Vietnam, Singapore, China) and a boundary case of nine Small Island Developing States (SIDS).</w:t>
+        <w:t xml:space="preserve">The study adopts a mixed synthesis-empirical design: (i) a three-level meta-analysis spanning 1982–2026 (k = 238 studies); and (ii) firm-level empirical analysis of World Bank Enterprise Survey (WBES) microdata across 49 Asian and Pacific economies (main analytic sample N = 91,982 firms), complemented by country-specific analyses (Vietnam, Singapore, China) and a boundary case of nine Small Island Developing States (SIDS).</w:t>
       </w:r>
     </w:p>
     <w:p>
@@ -344,7 +326,7 @@
         <w:pStyle w:val="BodyText"/>
       </w:pPr>
       <w:r>
-        <w:t xml:space="preserve">Key findings: (1) the I–P relationship is inverted-U shaped, but the turning point is not fixed, it declines with institutional quality, from roughly 55% export intensity in weak-institution economies to about 28% in strong-institution economies; (2) TCI is a foundational capability that universally shifts the performance level, whereas DAI is a situational resource that reshapes the curve and is most effective in weaker institutional environments (a "digital shield" effect); (3) in the SIDS group the relationship becomes monotonically negative with no turning point, a phenomenon the dissertation names the</w:t>
+        <w:t xml:space="preserve">Key findings: (1) the I–P relationship is inverted-U shaped, but the turning point is not fixed — it declines with institutional quality, from roughly 55% export intensity in weak-institution economies to about 28% in strong-institution economies; (2) TCI is a foundational capability that universally shifts the performance level, whereas DAI is a situational resource that reshapes the curve and is most effective in weaker institutional environments (a "digital shield" effect); (3) in the SIDS group the relationship becomes monotonically negative with no turning point — a phenomenon the dissertation names the</w:t>
       </w:r>
       <w:r>
         <w:t xml:space="preserve"> </w:t>
@@ -385,8 +367,8 @@
         </w:pict>
       </w:r>
     </w:p>
-    <w:bookmarkEnd w:id="25"/>
-    <w:bookmarkStart w:id="26" w:name="mục-lục"/>
+    <w:bookmarkEnd w:id="24"/>
+    <w:bookmarkStart w:id="25" w:name="mục-lục"/>
     <w:p>
       <w:pPr>
         <w:pStyle w:val="Heading2"/>
@@ -498,8 +480,8 @@
         </w:pict>
       </w:r>
     </w:p>
-    <w:bookmarkEnd w:id="26"/>
-    <w:bookmarkStart w:id="27" w:name="danh-mục-từ-viết-tắt"/>
+    <w:bookmarkEnd w:id="25"/>
+    <w:bookmarkStart w:id="26" w:name="danh-mục-từ-viết-tắt"/>
     <w:p>
       <w:pPr>
         <w:pStyle w:val="Heading2"/>
@@ -1709,8 +1691,8 @@
         </w:pict>
       </w:r>
     </w:p>
-    <w:bookmarkEnd w:id="27"/>
-    <w:bookmarkStart w:id="28" w:name="danh-mục-bảng"/>
+    <w:bookmarkEnd w:id="26"/>
+    <w:bookmarkStart w:id="27" w:name="danh-mục-bảng"/>
     <w:p>
       <w:pPr>
         <w:pStyle w:val="Heading2"/>
@@ -1728,11 +1710,11 @@
           <w:iCs/>
           <w:i/>
         </w:rPr>
-        <w:t xml:space="preserve">(Tự động cập nhật. Ví dụ: Bảng 4.1, Phân tán năng suất lao động và đặc điểm quốc tế hóa theo phân nhóm con ICRV; Bảng 4.2, Đổi mới sáng tạo và chấp nhận số theo phân nhóm con ICRV; Bảng định nghĩa biến cho từng nghiên cứu thành phần ở Chương 3; Bảng tổng hợp kết quả theo hệ giả thuyết §4.8.)</w:t>
-      </w:r>
-    </w:p>
-    <w:bookmarkEnd w:id="28"/>
-    <w:bookmarkStart w:id="29" w:name="danh-mục-hình"/>
+        <w:t xml:space="preserve">(Tự động cập nhật. Ví dụ: Bảng 4.1 — Phân tán năng suất lao động và đặc điểm quốc tế hóa theo phân nhóm con ICRV; Bảng 4.2 — Đổi mới sáng tạo và chấp nhận số theo phân nhóm con ICRV; Bảng định nghĩa biến cho từng nghiên cứu thành phần ở Chương 3; Bảng tổng hợp kết quả theo hệ giả thuyết §4.8.)</w:t>
+      </w:r>
+    </w:p>
+    <w:bookmarkEnd w:id="27"/>
+    <w:bookmarkStart w:id="28" w:name="danh-mục-hình"/>
     <w:p>
       <w:pPr>
         <w:pStyle w:val="Heading2"/>
@@ -1796,8 +1778,8 @@
         </w:pict>
       </w:r>
     </w:p>
-    <w:bookmarkEnd w:id="29"/>
-    <w:bookmarkStart w:id="30" w:name="X3131bb7fa4eac4deea1bc52d0a917d3422a5919"/>
+    <w:bookmarkEnd w:id="28"/>
+    <w:bookmarkStart w:id="29" w:name="X3131bb7fa4eac4deea1bc52d0a917d3422a5919"/>
     <w:p>
       <w:pPr>
         <w:pStyle w:val="Heading2"/>
@@ -1861,7 +1843,7 @@
           <w:iCs/>
           <w:i/>
         </w:rPr>
-        <w:t xml:space="preserve">(Cơ sở baseline meta-analysis, P1/P2.)</w:t>
+        <w:t xml:space="preserve">(Cơ sở baseline meta-analysis — P1/P2.)</w:t>
       </w:r>
     </w:p>
     <w:p>
@@ -1955,7 +1937,7 @@
         <w:pStyle w:val="Compact"/>
       </w:pPr>
       <w:r>
-        <w:t xml:space="preserve">Nghiên cứu thành phần P3, Việt Nam (bối cảnh chuyển đổi thu nhập trung bình thấp).</w:t>
+        <w:t xml:space="preserve">Nghiên cứu thành phần P3 — Việt Nam (bối cảnh chuyển đổi thu nhập trung bình thấp).</w:t>
       </w:r>
       <w:r>
         <w:t xml:space="preserve"> </w:t>
@@ -1977,7 +1959,7 @@
         <w:pStyle w:val="Compact"/>
       </w:pPr>
       <w:r>
-        <w:t xml:space="preserve">Nghiên cứu thành phần P4, Singapore (bối cảnh thể chế tiên tiến–đổi mới).</w:t>
+        <w:t xml:space="preserve">Nghiên cứu thành phần P4 — Singapore (bối cảnh thể chế tiên tiến–đổi mới).</w:t>
       </w:r>
       <w:r>
         <w:t xml:space="preserve"> </w:t>
@@ -1999,7 +1981,7 @@
         <w:pStyle w:val="Compact"/>
       </w:pPr>
       <w:r>
-        <w:t xml:space="preserve">Nghiên cứu thành phần P5, Trung Quốc 2012–2024 (bối cảnh upper-middle).</w:t>
+        <w:t xml:space="preserve">Nghiên cứu thành phần P5 — Trung Quốc 2012–2024 (bối cảnh upper-middle).</w:t>
       </w:r>
       <w:r>
         <w:t xml:space="preserve"> </w:t>
@@ -2021,7 +2003,7 @@
         <w:pStyle w:val="Compact"/>
       </w:pPr>
       <w:r>
-        <w:t xml:space="preserve">Nghiên cứu thành phần P6, Meta-analysis ba tầng mở rộng 1982–2026.</w:t>
+        <w:t xml:space="preserve">Nghiên cứu thành phần P6 — Meta-analysis ba tầng mở rộng 1982–2026.</w:t>
       </w:r>
       <w:r>
         <w:t xml:space="preserve"> </w:t>
@@ -2043,7 +2025,7 @@
         <w:pStyle w:val="Compact"/>
       </w:pPr>
       <w:r>
-        <w:t xml:space="preserve">Nghiên cứu thành phần P7, Kiểm định toàn mẫu 49 nền kinh tế châu Á và Thái Bình Dương (capstone).</w:t>
+        <w:t xml:space="preserve">Nghiên cứu thành phần P7 — Kiểm định toàn mẫu 49 nền kinh tế châu Á và Thái Bình Dương (capstone).</w:t>
       </w:r>
       <w:r>
         <w:t xml:space="preserve"> </w:t>
@@ -2065,7 +2047,7 @@
         <w:pStyle w:val="Compact"/>
       </w:pPr>
       <w:r>
-        <w:t xml:space="preserve">Nghiên cứu thành phần P8, Trường hợp biên SIDS, gánh nặng quốc tế hóa bắt buộc (FIP).</w:t>
+        <w:t xml:space="preserve">Nghiên cứu thành phần P8 — Trường hợp biên SIDS, gánh nặng quốc tế hóa bắt buộc (FIP).</w:t>
       </w:r>
       <w:r>
         <w:t xml:space="preserve"> </w:t>
@@ -2097,9 +2079,12 @@
         </w:pict>
       </w:r>
     </w:p>
+    <w:bookmarkEnd w:id="29"/>
     <w:bookmarkEnd w:id="30"/>
-    <w:bookmarkEnd w:id="31"/>
-    <w:sectPr/>
+    <w:sectPr>
+      <w:pgSz w:h="16838" w:w="11906"/>
+      <w:pgMar w:bottom="1134" w:left="1701" w:right="1134" w:top="1134"/>
+    </w:sectPr>
   </w:body>
 </w:document>
 </file>
@@ -2544,29 +2529,59 @@
   <w:style w:default="1" w:styleId="Normal" w:type="paragraph">
     <w:name w:val="Normal"/>
     <w:qFormat/>
+    <w:pPr>
+      <w:spacing w:line="360" w:lineRule="auto"/>
+      <w:jc w:val="both"/>
+    </w:pPr>
+    <w:rPr>
+      <w:rFonts w:ascii="Times New Roman" w:eastAsia="Times New Roman" w:hAnsi="Times New Roman"/>
+      <w:color w:val="000000"/>
+      <w:sz w:val="26"/>
+    </w:rPr>
   </w:style>
   <w:style w:styleId="BodyText" w:type="paragraph">
     <w:name w:val="Body Text"/>
     <w:basedOn w:val="Normal"/>
     <w:link w:val="BodyTextChar"/>
     <w:pPr>
-      <w:spacing w:after="180" w:before="180"/>
+      <w:spacing w:after="180" w:before="180" w:line="360" w:lineRule="auto"/>
+      <w:jc w:val="both"/>
     </w:pPr>
     <w:qFormat/>
+    <w:rPr>
+      <w:rFonts w:ascii="Times New Roman" w:eastAsia="Times New Roman" w:hAnsi="Times New Roman"/>
+      <w:color w:val="000000"/>
+      <w:sz w:val="26"/>
+    </w:rPr>
   </w:style>
   <w:style w:customStyle="1" w:styleId="FirstParagraph" w:type="paragraph">
     <w:name w:val="First Paragraph"/>
     <w:basedOn w:val="BodyText"/>
     <w:next w:val="BodyText"/>
     <w:qFormat/>
+    <w:pPr>
+      <w:spacing w:line="360" w:lineRule="auto"/>
+      <w:jc w:val="both"/>
+    </w:pPr>
+    <w:rPr>
+      <w:rFonts w:ascii="Times New Roman" w:eastAsia="Times New Roman" w:hAnsi="Times New Roman"/>
+      <w:color w:val="000000"/>
+      <w:sz w:val="26"/>
+    </w:rPr>
   </w:style>
   <w:style w:customStyle="1" w:styleId="Compact" w:type="paragraph">
     <w:name w:val="Compact"/>
     <w:basedOn w:val="BodyText"/>
     <w:qFormat/>
     <w:pPr>
-      <w:spacing w:after="36" w:before="36"/>
+      <w:spacing w:after="36" w:before="36" w:line="360" w:lineRule="auto"/>
+      <w:jc w:val="both"/>
     </w:pPr>
+    <w:rPr>
+      <w:rFonts w:ascii="Times New Roman" w:eastAsia="Times New Roman" w:hAnsi="Times New Roman"/>
+      <w:color w:val="000000"/>
+      <w:sz w:val="26"/>
+    </w:rPr>
   </w:style>
   <w:style w:styleId="Title" w:type="paragraph">
     <w:name w:val="Title"/>
@@ -2576,15 +2591,15 @@
     <w:pPr>
       <w:keepNext/>
       <w:keepLines/>
-      <w:spacing w:after="240" w:before="480"/>
-      <w:jc w:val="center"/>
+      <w:spacing w:after="240" w:before="480" w:line="360" w:lineRule="auto"/>
+      <w:jc w:val="both"/>
     </w:pPr>
     <w:rPr>
-      <w:rFonts w:asciiTheme="majorHAnsi" w:cstheme="majorBidi" w:eastAsiaTheme="majorEastAsia" w:hAnsiTheme="majorHAnsi"/>
+      <w:rFonts w:ascii="Times New Roman" w:asciiTheme="majorHAnsi" w:cstheme="majorBidi" w:eastAsia="Times New Roman" w:eastAsiaTheme="majorEastAsia" w:hAnsi="Times New Roman" w:hAnsiTheme="majorHAnsi"/>
       <w:b/>
       <w:bCs/>
-      <w:color w:themeColor="accent1" w:themeShade="B5" w:val="345A8A"/>
-      <w:sz w:val="36"/>
+      <w:color w:val="000000"/>
+      <w:sz w:val="26"/>
       <w:szCs w:val="36"/>
     </w:rPr>
   </w:style>
@@ -2596,11 +2611,13 @@
     <w:pPr>
       <w:keepNext/>
       <w:keepLines/>
-      <w:spacing w:after="240" w:before="240"/>
-      <w:jc w:val="center"/>
+      <w:spacing w:after="240" w:before="240" w:line="360" w:lineRule="auto"/>
+      <w:jc w:val="both"/>
     </w:pPr>
     <w:rPr>
-      <w:sz w:val="30"/>
+      <w:rFonts w:ascii="Times New Roman" w:eastAsia="Times New Roman" w:hAnsi="Times New Roman"/>
+      <w:color w:val="000000"/>
+      <w:sz w:val="26"/>
       <w:szCs w:val="30"/>
     </w:rPr>
   </w:style>
@@ -2611,8 +2628,14 @@
     <w:pPr>
       <w:keepNext/>
       <w:keepLines/>
-      <w:jc w:val="center"/>
+      <w:spacing w:line="360" w:lineRule="auto"/>
+      <w:jc w:val="both"/>
     </w:pPr>
+    <w:rPr>
+      <w:rFonts w:ascii="Times New Roman" w:eastAsia="Times New Roman" w:hAnsi="Times New Roman"/>
+      <w:color w:val="000000"/>
+      <w:sz w:val="26"/>
+    </w:rPr>
   </w:style>
   <w:style w:styleId="Date" w:type="paragraph">
     <w:name w:val="Date"/>
@@ -2621,8 +2644,14 @@
     <w:pPr>
       <w:keepNext/>
       <w:keepLines/>
-      <w:jc w:val="center"/>
+      <w:spacing w:line="360" w:lineRule="auto"/>
+      <w:jc w:val="both"/>
     </w:pPr>
+    <w:rPr>
+      <w:rFonts w:ascii="Times New Roman" w:eastAsia="Times New Roman" w:hAnsi="Times New Roman"/>
+      <w:color w:val="000000"/>
+      <w:sz w:val="26"/>
+    </w:rPr>
   </w:style>
   <w:style w:customStyle="1" w:styleId="AbstractTitle" w:type="paragraph">
     <w:name w:val="Abstract Title"/>
@@ -2632,15 +2661,15 @@
     <w:pPr>
       <w:keepNext/>
       <w:keepLines/>
-      <w:jc w:val="center"/>
-      <w:spacing w:after="0" w:before="300"/>
+      <w:jc w:val="both"/>
+      <w:spacing w:after="0" w:before="300" w:line="360" w:lineRule="auto"/>
     </w:pPr>
     <w:rPr>
-      <w:sz w:val="20"/>
+      <w:color w:val="000000"/>
+      <w:sz w:val="26"/>
       <w:szCs w:val="20"/>
+      <w:rFonts w:ascii="Times New Roman" w:eastAsia="Times New Roman" w:hAnsi="Times New Roman"/>
       <w:b/>
-      <w:color w:val="345A8A"/>
-      &gt;
     </w:rPr>
   </w:style>
   <w:style w:customStyle="1" w:styleId="Abstract" w:type="paragraph">
@@ -2651,10 +2680,13 @@
     <w:pPr>
       <w:keepNext/>
       <w:keepLines/>
-      <w:spacing w:after="300" w:before="100"/>
+      <w:spacing w:after="300" w:before="100" w:line="360" w:lineRule="auto"/>
+      <w:jc w:val="both"/>
     </w:pPr>
     <w:rPr>
-      <w:sz w:val="20"/>
+      <w:rFonts w:ascii="Times New Roman" w:eastAsia="Times New Roman" w:hAnsi="Times New Roman"/>
+      <w:color w:val="000000"/>
+      <w:sz w:val="26"/>
       <w:szCs w:val="20"/>
     </w:rPr>
   </w:style>
@@ -2663,8 +2695,15 @@
     <w:basedOn w:val="Normal"/>
     <w:next w:val="Bibliography"/>
     <w:qFormat/>
-    <w:pPr/>
-    <w:rPr/>
+    <w:pPr>
+      <w:spacing w:line="360" w:lineRule="auto"/>
+      <w:jc w:val="both"/>
+    </w:pPr>
+    <w:rPr>
+      <w:rFonts w:ascii="Times New Roman" w:eastAsia="Times New Roman" w:hAnsi="Times New Roman"/>
+      <w:color w:val="000000"/>
+      <w:sz w:val="26"/>
+    </w:rPr>
   </w:style>
   <w:style w:styleId="Heading1" w:type="paragraph">
     <w:name w:val="Heading 1"/>
@@ -2675,15 +2714,16 @@
     <w:pPr>
       <w:keepNext/>
       <w:keepLines/>
-      <w:spacing w:after="0" w:before="480"/>
+      <w:spacing w:after="0" w:before="480" w:line="360" w:lineRule="auto"/>
+      <w:jc w:val="both"/>
       <w:outlineLvl w:val="0"/>
     </w:pPr>
     <w:rPr>
-      <w:rFonts w:asciiTheme="majorHAnsi" w:cstheme="majorBidi" w:eastAsiaTheme="majorEastAsia" w:hAnsiTheme="majorHAnsi"/>
+      <w:rFonts w:ascii="Times New Roman" w:asciiTheme="majorHAnsi" w:cstheme="majorBidi" w:eastAsia="Times New Roman" w:eastAsiaTheme="majorEastAsia" w:hAnsi="Times New Roman" w:hAnsiTheme="majorHAnsi"/>
       <w:b/>
       <w:bCs/>
-      <w:color w:themeColor="accent1" w:val="4F81BD"/>
-      <w:sz w:val="32"/>
+      <w:color w:val="000000"/>
+      <w:sz w:val="26"/>
       <w:szCs w:val="32"/>
     </w:rPr>
   </w:style>
@@ -2697,15 +2737,16 @@
     <w:pPr>
       <w:keepNext/>
       <w:keepLines/>
-      <w:spacing w:after="0" w:before="200"/>
+      <w:spacing w:after="0" w:before="200" w:line="360" w:lineRule="auto"/>
+      <w:jc w:val="both"/>
       <w:outlineLvl w:val="1"/>
     </w:pPr>
     <w:rPr>
-      <w:rFonts w:asciiTheme="majorHAnsi" w:cstheme="majorBidi" w:eastAsiaTheme="majorEastAsia" w:hAnsiTheme="majorHAnsi"/>
+      <w:rFonts w:ascii="Times New Roman" w:asciiTheme="majorHAnsi" w:cstheme="majorBidi" w:eastAsia="Times New Roman" w:eastAsiaTheme="majorEastAsia" w:hAnsi="Times New Roman" w:hAnsiTheme="majorHAnsi"/>
       <w:b/>
       <w:bCs/>
-      <w:color w:themeColor="accent1" w:val="4F81BD"/>
-      <w:sz w:val="28"/>
+      <w:color w:val="000000"/>
+      <w:sz w:val="26"/>
       <w:szCs w:val="28"/>
     </w:rPr>
   </w:style>
@@ -2719,15 +2760,16 @@
     <w:pPr>
       <w:keepNext/>
       <w:keepLines/>
-      <w:spacing w:after="0" w:before="200"/>
+      <w:spacing w:after="0" w:before="200" w:line="360" w:lineRule="auto"/>
+      <w:jc w:val="both"/>
       <w:outlineLvl w:val="2"/>
     </w:pPr>
     <w:rPr>
-      <w:rFonts w:asciiTheme="majorHAnsi" w:cstheme="majorBidi" w:eastAsiaTheme="majorEastAsia" w:hAnsiTheme="majorHAnsi"/>
+      <w:rFonts w:ascii="Times New Roman" w:asciiTheme="majorHAnsi" w:cstheme="majorBidi" w:eastAsia="Times New Roman" w:eastAsiaTheme="majorEastAsia" w:hAnsi="Times New Roman" w:hAnsiTheme="majorHAnsi"/>
       <w:b/>
       <w:bCs/>
-      <w:color w:themeColor="accent1" w:val="4F81BD"/>
-      <w:sz w:val="24"/>
+      <w:color w:val="000000"/>
+      <w:sz w:val="26"/>
       <w:szCs w:val="24"/>
     </w:rPr>
   </w:style>
@@ -2741,15 +2783,16 @@
     <w:pPr>
       <w:keepNext/>
       <w:keepLines/>
-      <w:spacing w:after="0" w:before="200"/>
+      <w:spacing w:after="0" w:before="200" w:line="360" w:lineRule="auto"/>
+      <w:jc w:val="both"/>
       <w:outlineLvl w:val="3"/>
     </w:pPr>
     <w:rPr>
-      <w:rFonts w:asciiTheme="majorHAnsi" w:cstheme="majorBidi" w:eastAsiaTheme="majorEastAsia" w:hAnsiTheme="majorHAnsi"/>
+      <w:rFonts w:ascii="Times New Roman" w:asciiTheme="majorHAnsi" w:cstheme="majorBidi" w:eastAsia="Times New Roman" w:eastAsiaTheme="majorEastAsia" w:hAnsi="Times New Roman" w:hAnsiTheme="majorHAnsi"/>
       <w:i/>
       <w:bCs/>
-      <w:color w:themeColor="accent1" w:val="4F81BD"/>
-      <w:sz w:val="24"/>
+      <w:color w:val="000000"/>
+      <w:sz w:val="26"/>
       <w:szCs w:val="24"/>
     </w:rPr>
   </w:style>
@@ -2763,14 +2806,15 @@
     <w:pPr>
       <w:keepNext/>
       <w:keepLines/>
-      <w:spacing w:after="0" w:before="200"/>
+      <w:spacing w:after="0" w:before="200" w:line="360" w:lineRule="auto"/>
+      <w:jc w:val="both"/>
       <w:outlineLvl w:val="4"/>
     </w:pPr>
     <w:rPr>
-      <w:rFonts w:asciiTheme="majorHAnsi" w:cstheme="majorBidi" w:eastAsiaTheme="majorEastAsia" w:hAnsiTheme="majorHAnsi"/>
+      <w:rFonts w:ascii="Times New Roman" w:asciiTheme="majorHAnsi" w:cstheme="majorBidi" w:eastAsia="Times New Roman" w:eastAsiaTheme="majorEastAsia" w:hAnsi="Times New Roman" w:hAnsiTheme="majorHAnsi"/>
       <w:iCs/>
-      <w:color w:themeColor="accent1" w:val="4F81BD"/>
-      <w:sz w:val="24"/>
+      <w:color w:val="000000"/>
+      <w:sz w:val="26"/>
       <w:szCs w:val="24"/>
     </w:rPr>
   </w:style>
@@ -2784,13 +2828,14 @@
     <w:pPr>
       <w:keepNext/>
       <w:keepLines/>
-      <w:spacing w:after="0" w:before="200"/>
+      <w:spacing w:after="0" w:before="200" w:line="360" w:lineRule="auto"/>
+      <w:jc w:val="both"/>
       <w:outlineLvl w:val="5"/>
     </w:pPr>
     <w:rPr>
-      <w:rFonts w:asciiTheme="majorHAnsi" w:cstheme="majorBidi" w:eastAsiaTheme="majorEastAsia" w:hAnsiTheme="majorHAnsi"/>
-      <w:color w:themeColor="accent1" w:val="4F81BD"/>
-      <w:sz w:val="24"/>
+      <w:rFonts w:ascii="Times New Roman" w:asciiTheme="majorHAnsi" w:cstheme="majorBidi" w:eastAsia="Times New Roman" w:eastAsiaTheme="majorEastAsia" w:hAnsi="Times New Roman" w:hAnsiTheme="majorHAnsi"/>
+      <w:color w:val="000000"/>
+      <w:sz w:val="26"/>
       <w:szCs w:val="24"/>
     </w:rPr>
   </w:style>
@@ -2804,13 +2849,14 @@
     <w:pPr>
       <w:keepNext/>
       <w:keepLines/>
-      <w:spacing w:after="0" w:before="200"/>
+      <w:spacing w:after="0" w:before="200" w:line="360" w:lineRule="auto"/>
+      <w:jc w:val="both"/>
       <w:outlineLvl w:val="6"/>
     </w:pPr>
     <w:rPr>
-      <w:rFonts w:asciiTheme="majorHAnsi" w:cstheme="majorBidi" w:eastAsiaTheme="majorEastAsia" w:hAnsiTheme="majorHAnsi"/>
-      <w:color w:themeColor="accent1" w:val="4F81BD"/>
-      <w:sz w:val="24"/>
+      <w:rFonts w:ascii="Times New Roman" w:asciiTheme="majorHAnsi" w:cstheme="majorBidi" w:eastAsia="Times New Roman" w:eastAsiaTheme="majorEastAsia" w:hAnsi="Times New Roman" w:hAnsiTheme="majorHAnsi"/>
+      <w:color w:val="000000"/>
+      <w:sz w:val="26"/>
       <w:szCs w:val="24"/>
     </w:rPr>
   </w:style>
@@ -2824,13 +2870,14 @@
     <w:pPr>
       <w:keepNext/>
       <w:keepLines/>
-      <w:spacing w:after="0" w:before="200"/>
+      <w:spacing w:after="0" w:before="200" w:line="360" w:lineRule="auto"/>
+      <w:jc w:val="both"/>
       <w:outlineLvl w:val="7"/>
     </w:pPr>
     <w:rPr>
-      <w:rFonts w:asciiTheme="majorHAnsi" w:cstheme="majorBidi" w:eastAsiaTheme="majorEastAsia" w:hAnsiTheme="majorHAnsi"/>
-      <w:color w:themeColor="accent1" w:val="4F81BD"/>
-      <w:sz w:val="24"/>
+      <w:rFonts w:ascii="Times New Roman" w:asciiTheme="majorHAnsi" w:cstheme="majorBidi" w:eastAsia="Times New Roman" w:eastAsiaTheme="majorEastAsia" w:hAnsi="Times New Roman" w:hAnsiTheme="majorHAnsi"/>
+      <w:color w:val="000000"/>
+      <w:sz w:val="26"/>
       <w:szCs w:val="24"/>
     </w:rPr>
   </w:style>
@@ -2844,13 +2891,14 @@
     <w:pPr>
       <w:keepNext/>
       <w:keepLines/>
-      <w:spacing w:after="0" w:before="200"/>
+      <w:spacing w:after="0" w:before="200" w:line="360" w:lineRule="auto"/>
+      <w:jc w:val="both"/>
       <w:outlineLvl w:val="8"/>
     </w:pPr>
     <w:rPr>
-      <w:rFonts w:asciiTheme="majorHAnsi" w:cstheme="majorBidi" w:eastAsiaTheme="majorEastAsia" w:hAnsiTheme="majorHAnsi"/>
-      <w:color w:themeColor="accent1" w:val="4F81BD"/>
-      <w:sz w:val="24"/>
+      <w:rFonts w:ascii="Times New Roman" w:asciiTheme="majorHAnsi" w:cstheme="majorBidi" w:eastAsia="Times New Roman" w:eastAsiaTheme="majorEastAsia" w:hAnsi="Times New Roman" w:hAnsiTheme="majorHAnsi"/>
+      <w:color w:val="000000"/>
+      <w:sz w:val="26"/>
       <w:szCs w:val="24"/>
     </w:rPr>
   </w:style>
@@ -2862,9 +2910,15 @@
     <w:unhideWhenUsed/>
     <w:qFormat/>
     <w:pPr>
-      <w:spacing w:after="100" w:before="100"/>
+      <w:spacing w:after="100" w:before="100" w:line="360" w:lineRule="auto"/>
       <w:ind w:firstLine="0" w:left="480" w:right="480"/>
+      <w:jc w:val="both"/>
     </w:pPr>
+    <w:rPr>
+      <w:rFonts w:ascii="Times New Roman" w:eastAsia="Times New Roman" w:hAnsi="Times New Roman"/>
+      <w:color w:val="000000"/>
+      <w:sz w:val="26"/>
+    </w:rPr>
   </w:style>
   <w:style w:styleId="FootnoteText" w:type="paragraph">
     <w:name w:val="Footnote Text"/>
@@ -2873,11 +2927,25 @@
     <w:uiPriority w:val="9"/>
     <w:unhideWhenUsed/>
     <w:qFormat/>
+    <w:pPr>
+      <w:spacing w:line="360" w:lineRule="auto"/>
+      <w:jc w:val="both"/>
+    </w:pPr>
+    <w:rPr>
+      <w:rFonts w:ascii="Times New Roman" w:eastAsia="Times New Roman" w:hAnsi="Times New Roman"/>
+      <w:color w:val="000000"/>
+      <w:sz w:val="26"/>
+    </w:rPr>
   </w:style>
   <w:style w:default="1" w:styleId="DefaultParagraphFont" w:type="character">
     <w:name w:val="Default Paragraph Font"/>
     <w:semiHidden/>
     <w:unhideWhenUsed/>
+    <w:rPr>
+      <w:rFonts w:ascii="Times New Roman" w:eastAsia="Times New Roman" w:hAnsi="Times New Roman"/>
+      <w:color w:val="000000"/>
+      <w:sz w:val="26"/>
+    </w:rPr>
   </w:style>
   <w:style w:default="1" w:styleId="Table" w:type="table">
     <w:name w:val="Table"/>
@@ -2885,6 +2953,15 @@
     <w:semiHidden/>
     <w:unhideWhenUsed/>
     <w:qFormat/>
+    <w:pPr>
+      <w:spacing w:line="360" w:lineRule="auto"/>
+      <w:jc w:val="both"/>
+    </w:pPr>
+    <w:rPr>
+      <w:rFonts w:ascii="Times New Roman" w:eastAsia="Times New Roman" w:hAnsi="Times New Roman"/>
+      <w:color w:val="000000"/>
+      <w:sz w:val="26"/>
+    </w:rPr>
     <w:tblPr>
       <w:tblInd w:type="dxa" w:w="0"/>
       <w:tblCellMar>
@@ -2917,25 +2994,42 @@
     <w:pPr>
       <w:keepNext/>
       <w:keepLines/>
-      <w:spacing w:after="0"/>
+      <w:spacing w:after="0" w:line="360" w:lineRule="auto"/>
+      <w:jc w:val="both"/>
     </w:pPr>
     <w:rPr>
+      <w:rFonts w:ascii="Times New Roman" w:eastAsia="Times New Roman" w:hAnsi="Times New Roman"/>
       <w:b/>
+      <w:color w:val="000000"/>
+      <w:sz w:val="26"/>
     </w:rPr>
   </w:style>
   <w:style w:customStyle="1" w:styleId="Definition" w:type="paragraph">
     <w:name w:val="Definition"/>
     <w:basedOn w:val="Normal"/>
+    <w:pPr>
+      <w:spacing w:line="360" w:lineRule="auto"/>
+      <w:jc w:val="both"/>
+    </w:pPr>
+    <w:rPr>
+      <w:rFonts w:ascii="Times New Roman" w:eastAsia="Times New Roman" w:hAnsi="Times New Roman"/>
+      <w:color w:val="000000"/>
+      <w:sz w:val="26"/>
+    </w:rPr>
   </w:style>
   <w:style w:styleId="Caption" w:type="paragraph">
     <w:name w:val="Caption"/>
     <w:basedOn w:val="Normal"/>
     <w:link w:val="BodyTextChar"/>
     <w:pPr>
-      <w:spacing w:after="120" w:before="0"/>
+      <w:spacing w:after="120" w:before="0" w:line="360" w:lineRule="auto"/>
+      <w:jc w:val="both"/>
     </w:pPr>
     <w:rPr>
+      <w:rFonts w:ascii="Times New Roman" w:eastAsia="Times New Roman" w:hAnsi="Times New Roman"/>
       <w:i/>
+      <w:color w:val="000000"/>
+      <w:sz w:val="26"/>
     </w:rPr>
   </w:style>
   <w:style w:customStyle="1" w:styleId="TableCaption" w:type="paragraph">
@@ -2943,44 +3037,90 @@
     <w:basedOn w:val="Caption"/>
     <w:pPr>
       <w:keepNext/>
+      <w:spacing w:line="360" w:lineRule="auto"/>
+      <w:jc w:val="both"/>
     </w:pPr>
+    <w:rPr>
+      <w:rFonts w:ascii="Times New Roman" w:eastAsia="Times New Roman" w:hAnsi="Times New Roman"/>
+      <w:color w:val="000000"/>
+      <w:sz w:val="26"/>
+    </w:rPr>
   </w:style>
   <w:style w:customStyle="1" w:styleId="ImageCaption" w:type="paragraph">
     <w:name w:val="Image Caption"/>
     <w:basedOn w:val="Caption"/>
+    <w:pPr>
+      <w:spacing w:line="360" w:lineRule="auto"/>
+      <w:jc w:val="both"/>
+    </w:pPr>
+    <w:rPr>
+      <w:rFonts w:ascii="Times New Roman" w:eastAsia="Times New Roman" w:hAnsi="Times New Roman"/>
+      <w:color w:val="000000"/>
+      <w:sz w:val="26"/>
+    </w:rPr>
   </w:style>
   <w:style w:customStyle="1" w:styleId="Figure" w:type="paragraph">
     <w:name w:val="Figure"/>
     <w:basedOn w:val="Normal"/>
+    <w:pPr>
+      <w:spacing w:line="360" w:lineRule="auto"/>
+      <w:jc w:val="both"/>
+    </w:pPr>
+    <w:rPr>
+      <w:rFonts w:ascii="Times New Roman" w:eastAsia="Times New Roman" w:hAnsi="Times New Roman"/>
+      <w:color w:val="000000"/>
+      <w:sz w:val="26"/>
+    </w:rPr>
   </w:style>
   <w:style w:customStyle="1" w:styleId="CaptionedFigure" w:type="paragraph">
     <w:name w:val="Captioned Figure"/>
     <w:basedOn w:val="Figure"/>
     <w:pPr>
       <w:keepNext/>
+      <w:spacing w:line="360" w:lineRule="auto"/>
+      <w:jc w:val="both"/>
     </w:pPr>
+    <w:rPr>
+      <w:rFonts w:ascii="Times New Roman" w:eastAsia="Times New Roman" w:hAnsi="Times New Roman"/>
+      <w:color w:val="000000"/>
+      <w:sz w:val="26"/>
+    </w:rPr>
   </w:style>
   <w:style w:customStyle="1" w:styleId="BodyTextChar" w:type="character">
     <w:name w:val="Body Text Char"/>
     <w:basedOn w:val="DefaultParagraphFont"/>
     <w:link w:val="BodyText"/>
+    <w:rPr>
+      <w:rFonts w:ascii="Times New Roman" w:eastAsia="Times New Roman" w:hAnsi="Times New Roman"/>
+      <w:color w:val="000000"/>
+      <w:sz w:val="26"/>
+    </w:rPr>
   </w:style>
   <w:style w:customStyle="1" w:styleId="VerbatimChar" w:type="character">
     <w:name w:val="Verbatim Char"/>
     <w:basedOn w:val="BodyTextChar"/>
     <w:rPr>
-      <w:rFonts w:ascii="Consolas" w:hAnsi="Consolas"/>
-      <w:sz w:val="22"/>
+      <w:rFonts w:ascii="Times New Roman" w:eastAsia="Times New Roman" w:hAnsi="Times New Roman"/>
+      <w:color w:val="000000"/>
+      <w:sz w:val="26"/>
     </w:rPr>
   </w:style>
   <w:style w:customStyle="1" w:styleId="SectionNumber" w:type="character">
     <w:name w:val="Section Number"/>
     <w:basedOn w:val="BodyTextChar"/>
+    <w:rPr>
+      <w:rFonts w:ascii="Times New Roman" w:eastAsia="Times New Roman" w:hAnsi="Times New Roman"/>
+      <w:color w:val="000000"/>
+      <w:sz w:val="26"/>
+    </w:rPr>
   </w:style>
   <w:style w:styleId="FootnoteReference" w:type="character">
     <w:name w:val="Footnote Reference"/>
     <w:basedOn w:val="BodyTextChar"/>
     <w:rPr>
+      <w:rFonts w:ascii="Times New Roman" w:eastAsia="Times New Roman" w:hAnsi="Times New Roman"/>
+      <w:color w:val="000000"/>
+      <w:sz w:val="26"/>
       <w:vertAlign w:val="superscript"/>
     </w:rPr>
   </w:style>
@@ -2988,7 +3128,9 @@
     <w:name w:val="Hyperlink"/>
     <w:basedOn w:val="BodyTextChar"/>
     <w:rPr>
-      <w:color w:themeColor="accent1" w:val="4F81BD"/>
+      <w:rFonts w:ascii="Times New Roman" w:eastAsia="Times New Roman" w:hAnsi="Times New Roman"/>
+      <w:color w:val="000000"/>
+      <w:sz w:val="26"/>
     </w:rPr>
   </w:style>
   <w:style w:styleId="TOCHeading" w:type="paragraph">
@@ -2999,14 +3141,16 @@
     <w:unhideWhenUsed/>
     <w:qFormat/>
     <w:pPr>
-      <w:spacing w:before="240" w:line="259" w:lineRule="auto"/>
+      <w:spacing w:before="240" w:line="360" w:lineRule="auto"/>
+      <w:jc w:val="both"/>
       <w:outlineLvl w:val="9"/>
     </w:pPr>
     <w:rPr>
-      <w:rFonts w:asciiTheme="majorHAnsi" w:cstheme="majorBidi" w:eastAsiaTheme="majorEastAsia" w:hAnsiTheme="majorHAnsi"/>
+      <w:rFonts w:ascii="Times New Roman" w:asciiTheme="majorHAnsi" w:cstheme="majorBidi" w:eastAsia="Times New Roman" w:eastAsiaTheme="majorEastAsia" w:hAnsi="Times New Roman" w:hAnsiTheme="majorHAnsi"/>
       <w:b w:val="0"/>
       <w:bCs w:val="0"/>
-      <w:color w:themeColor="accent1" w:themeShade="BF" w:val="365F91"/>
+      <w:color w:val="000000"/>
+      <w:sz w:val="26"/>
     </w:rPr>
   </w:style>
   <w:style w:type="paragraph" w:customStyle="1" w:styleId="SourceCode">

</xml_diff>

<commit_message>
docs(integrity): declare dissertation is built from candidate's own two chuyen de
The two chuyen de (PhD coursework monographs, assigned by CTU decision) are the core content of the
dissertation, so the manuscript legitimately overlaps with them. Added an explicit statement to the
LOI CAM DOAN that the dissertation is developed from the candidate's own two chuyen de and that the
resulting overlap is the author's own prior work, not copying. Synced dist + rebuilt front-matter
docx. Updated LIEM_CHINH_KHOA_HOC_compliance.md (Art.2.3 row + Art.18 task) with guidance to exclude
the candidate's own chuyen de from the similarity-check corpus and attach the assignment decision.
</commit_message>
<xml_diff>
--- a/dist/luan_an_ctu/00_phan_dau_vi.docx
+++ b/dist/luan_an_ctu/00_phan_dau_vi.docx
@@ -152,7 +152,23 @@
         <w:t xml:space="preserve"> </w:t>
       </w:r>
       <w:r>
-        <w:t xml:space="preserve">(luận án được thực hiện theo định hướng kết hợp các công trình thành phần). Dữ liệu sử dụng là dữ liệu thứ cấp công khai từ Khảo sát Doanh nghiệp của Ngân hàng Thế giới (World Bank Enterprise Surveys). Mọi trích dẫn từ các nghiên cứu khác đều được nêu rõ nguồn theo chuẩn APA 7th và được liệt kê đầy đủ trong danh mục tài liệu tham khảo. Tôi xin chịu trách nhiệm hoàn toàn về nội dung khoa học của luận án này.</w:t>
+        <w:t xml:space="preserve">(luận án được thực hiện theo định hướng kết hợp các công trình thành phần). Luận án được phát triển trên cơ sở</w:t>
+      </w:r>
+      <w:r>
+        <w:t xml:space="preserve"> </w:t>
+      </w:r>
+      <w:r>
+        <w:rPr>
+          <w:bCs/>
+          <w:b/>
+        </w:rPr>
+        <w:t xml:space="preserve">hai chuyên đề tiến sĩ do chính tôi thực hiện trong khuôn khổ chương trình đào tạo tiến sĩ tại Trường Đại học Cần Thơ</w:t>
+      </w:r>
+      <w:r>
+        <w:t xml:space="preserve"> </w:t>
+      </w:r>
+      <w:r>
+        <w:t xml:space="preserve">(theo Quyết định giao chuyên đề của Nhà trường); do đó, một phần nội dung của luận án kế thừa và có thể trùng lặp với hai chuyên đề này — đây là phần công trình của chính tôi, không phải sao chép từ nguồn của người khác. Dữ liệu sử dụng là dữ liệu thứ cấp công khai từ Khảo sát Doanh nghiệp của Ngân hàng Thế giới (World Bank Enterprise Surveys). Mọi trích dẫn từ các nghiên cứu khác đều được nêu rõ nguồn theo chuẩn APA 7th và được liệt kê đầy đủ trong danh mục tài liệu tham khảo. Tôi xin chịu trách nhiệm hoàn toàn về nội dung khoa học của luận án này.</w:t>
       </w:r>
     </w:p>
     <w:p>

</xml_diff>

<commit_message>
fix(dissertation): add published India chapter (Do & Phan 2025, IntechOpen) as a dissertation component
The author's peer-reviewed India book chapter (Do, T. H., & Phan, A. T. (2025). Internationalization
and firm performance of firms in India: The role of top management. IntechOpen.
doi:10.5772/intechopen.1011012) was missing from the dissertation's list of works. It is a published
component on the managerial-characteristics (upper-echelons / H4) tier. Actions:
- Added to 'DANH MUC CONG TRINH' section A (published), renumbered the list (1-10).
- Added to thesis/04_references_apa7.md.
- Cited at H4 in dissertation 2.5.5 and P7 section 2.5 (ibr/apjm/jibs) alongside Phan et al. (2020).
- Fixed a citation error in p7/08 ('Tu, P. A.' -> 'Phan, A. T.').
docx rebuilt.
</commit_message>
<xml_diff>
--- a/dist/luan_an_ctu/00_phan_dau_vi.docx
+++ b/dist/luan_an_ctu/00_phan_dau_vi.docx
@@ -30,7 +30,7 @@
         <w:t xml:space="preserve">─────────────────────────────────────────</w:t>
       </w:r>
     </w:p>
-    <w:bookmarkStart w:id="30" w:name="đỗ-thùy-hương"/>
+    <w:bookmarkStart w:id="31" w:name="đỗ-thùy-hương"/>
     <w:p>
       <w:pPr>
         <w:pStyle w:val="Heading1"/>
@@ -1795,7 +1795,7 @@
       </w:r>
     </w:p>
     <w:bookmarkEnd w:id="28"/>
-    <w:bookmarkStart w:id="29" w:name="X3131bb7fa4eac4deea1bc52d0a917d3422a5919"/>
+    <w:bookmarkStart w:id="30" w:name="X3131bb7fa4eac4deea1bc52d0a917d3422a5919"/>
     <w:p>
       <w:pPr>
         <w:pStyle w:val="Heading2"/>
@@ -1871,6 +1871,52 @@
         <w:pStyle w:val="Compact"/>
       </w:pPr>
       <w:r>
+        <w:t xml:space="preserve">Do, T. H., &amp; Phan, A. T. (2025). Internationalization and firm performance of firms in India: The role of top management. In M. Bartekova (Ed.),</w:t>
+      </w:r>
+      <w:r>
+        <w:t xml:space="preserve"> </w:t>
+      </w:r>
+      <w:r>
+        <w:rPr>
+          <w:iCs/>
+          <w:i/>
+        </w:rPr>
+        <w:t xml:space="preserve">International business research: Traditional and creative approaches</w:t>
+      </w:r>
+      <w:r>
+        <w:t xml:space="preserve">. IntechOpen.</w:t>
+      </w:r>
+      <w:r>
+        <w:t xml:space="preserve"> </w:t>
+      </w:r>
+      <w:hyperlink r:id="rId29">
+        <w:r>
+          <w:rPr>
+            <w:rStyle w:val="Hyperlink"/>
+          </w:rPr>
+          <w:t xml:space="preserve">https://doi.org/10.5772/intechopen.1011012</w:t>
+        </w:r>
+      </w:hyperlink>
+      <w:r>
+        <w:t xml:space="preserve"> </w:t>
+      </w:r>
+      <w:r>
+        <w:rPr>
+          <w:iCs/>
+          <w:i/>
+        </w:rPr>
+        <w:t xml:space="preserve">(Chương sách bình duyệt — bằng chứng country-level India về vai trò điều tiết của đặc điểm nhà quản trị cấp cao; gắn với tầng thượng tầng quản trị/H4 của luận án.)</w:t>
+      </w:r>
+    </w:p>
+    <w:p>
+      <w:pPr>
+        <w:numPr>
+          <w:ilvl w:val="0"/>
+          <w:numId w:val="1003"/>
+        </w:numPr>
+        <w:pStyle w:val="Compact"/>
+      </w:pPr>
+      <w:r>
         <w:t xml:space="preserve">Do, T. H., &amp; Phan, A. T. (2026). Firm performance heterogeneity in emerging Asia: Evidence from World Bank Enterprise Surveys.</w:t>
       </w:r>
       <w:r>
@@ -2095,8 +2141,8 @@
         </w:pict>
       </w:r>
     </w:p>
-    <w:bookmarkEnd w:id="29"/>
     <w:bookmarkEnd w:id="30"/>
+    <w:bookmarkEnd w:id="31"/>
     <w:sectPr>
       <w:pgSz w:h="16838" w:w="11906"/>
       <w:pgMar w:bottom="1134" w:left="1701" w:right="1134" w:top="1134"/>
@@ -2367,11 +2413,11 @@
       </w:pPr>
     </w:lvl>
   </w:abstractNum>
-  <w:abstractNum w:abstractNumId="99414">
-    <w:nsid w:val="A99414"/>
+  <w:abstractNum w:abstractNumId="99415">
+    <w:nsid w:val="A99415"/>
     <w:multiLevelType w:val="multilevel"/>
     <w:lvl w:ilvl="0">
-      <w:start w:val="4"/>
+      <w:start w:val="5"/>
       <w:numFmt w:val="decimal"/>
       <w:lvlText w:val="%1."/>
       <w:lvlJc w:val="left"/>
@@ -2380,7 +2426,7 @@
       </w:pPr>
     </w:lvl>
     <w:lvl w:ilvl="1">
-      <w:start w:val="4"/>
+      <w:start w:val="5"/>
       <w:numFmt w:val="decimal"/>
       <w:lvlText w:val="%2."/>
       <w:lvlJc w:val="left"/>
@@ -2389,7 +2435,7 @@
       </w:pPr>
     </w:lvl>
     <w:lvl w:ilvl="2">
-      <w:start w:val="4"/>
+      <w:start w:val="5"/>
       <w:numFmt w:val="decimal"/>
       <w:lvlText w:val="%3."/>
       <w:lvlJc w:val="left"/>
@@ -2398,7 +2444,7 @@
       </w:pPr>
     </w:lvl>
     <w:lvl w:ilvl="3">
-      <w:start w:val="4"/>
+      <w:start w:val="5"/>
       <w:numFmt w:val="decimal"/>
       <w:lvlText w:val="%4."/>
       <w:lvlJc w:val="left"/>
@@ -2407,7 +2453,7 @@
       </w:pPr>
     </w:lvl>
     <w:lvl w:ilvl="4">
-      <w:start w:val="4"/>
+      <w:start w:val="5"/>
       <w:numFmt w:val="decimal"/>
       <w:lvlText w:val="%5."/>
       <w:lvlJc w:val="left"/>
@@ -2416,7 +2462,7 @@
       </w:pPr>
     </w:lvl>
     <w:lvl w:ilvl="5">
-      <w:start w:val="4"/>
+      <w:start w:val="5"/>
       <w:numFmt w:val="decimal"/>
       <w:lvlText w:val="%6."/>
       <w:lvlJc w:val="left"/>
@@ -2425,7 +2471,7 @@
       </w:pPr>
     </w:lvl>
     <w:lvl w:ilvl="6">
-      <w:start w:val="4"/>
+      <w:start w:val="5"/>
       <w:numFmt w:val="decimal"/>
       <w:lvlText w:val="%7."/>
       <w:lvlJc w:val="left"/>
@@ -2434,7 +2480,7 @@
       </w:pPr>
     </w:lvl>
     <w:lvl w:ilvl="7">
-      <w:start w:val="4"/>
+      <w:start w:val="5"/>
       <w:numFmt w:val="decimal"/>
       <w:lvlText w:val="%8."/>
       <w:lvlJc w:val="left"/>
@@ -2443,7 +2489,7 @@
       </w:pPr>
     </w:lvl>
     <w:lvl w:ilvl="8">
-      <w:start w:val="4"/>
+      <w:start w:val="5"/>
       <w:numFmt w:val="decimal"/>
       <w:lvlText w:val="%9."/>
       <w:lvlJc w:val="left"/>
@@ -2492,33 +2538,33 @@
     </w:lvlOverride>
   </w:num>
   <w:num w:numId="1004">
-    <w:abstractNumId w:val="99414"/>
+    <w:abstractNumId w:val="99415"/>
     <w:lvlOverride w:ilvl="0">
-      <w:startOverride w:val="4"/>
+      <w:startOverride w:val="5"/>
     </w:lvlOverride>
     <w:lvlOverride w:ilvl="1">
-      <w:startOverride w:val="4"/>
+      <w:startOverride w:val="5"/>
     </w:lvlOverride>
     <w:lvlOverride w:ilvl="2">
-      <w:startOverride w:val="4"/>
+      <w:startOverride w:val="5"/>
     </w:lvlOverride>
     <w:lvlOverride w:ilvl="3">
-      <w:startOverride w:val="4"/>
+      <w:startOverride w:val="5"/>
     </w:lvlOverride>
     <w:lvlOverride w:ilvl="4">
-      <w:startOverride w:val="4"/>
+      <w:startOverride w:val="5"/>
     </w:lvlOverride>
     <w:lvlOverride w:ilvl="5">
-      <w:startOverride w:val="4"/>
+      <w:startOverride w:val="5"/>
     </w:lvlOverride>
     <w:lvlOverride w:ilvl="6">
-      <w:startOverride w:val="4"/>
+      <w:startOverride w:val="5"/>
     </w:lvlOverride>
     <w:lvlOverride w:ilvl="7">
-      <w:startOverride w:val="4"/>
+      <w:startOverride w:val="5"/>
     </w:lvlOverride>
     <w:lvlOverride w:ilvl="8">
-      <w:startOverride w:val="4"/>
+      <w:startOverride w:val="5"/>
     </w:lvlOverride>
   </w:num>
 </w:numbering>

</xml_diff>

<commit_message>
fix(dissertation): recognize India as P9 (published) + propagate P8 7-Pacific-SIDS into chapters
P9 (India): the author confirmed the published India study (Do & Phan 2025, IntechOpen; 380 WBES firms,
FGLS, data to 2025) is dissertation component P9. Labelled it P9 in the publications list, updated the
component framing P1-P8 -> P1-P9 (front matter, chuong_5 5.6.1 with a new P9 bullet, draft positioning
docs), added India to the abstract's country-analysis list, and cited it at the H4 tier.

P8 consistency: the earlier 7-Pacific-SIDS re-scope had not propagated to the dissertation body.
Updated chuong_3 3.4.5.5 and chuong_4 4.7/4.8 to the 7-economy results (N=959; 132 exporters/13.8%;
mean FSTS 0.048; M1 beta=-1.339 p<.001; TCI now significant +0.299 p=.003; year-FE -3.351; bivariate
-0.864 p=.050; exporters-only N=26 -1.176 p=.130 NS), dropping Comoros + Timor-Leste from the country
list. Canonical chapters now carry 0 stale P8 numbers. docx rebuilt.
</commit_message>
<xml_diff>
--- a/dist/luan_an_ctu/00_phan_dau_vi.docx
+++ b/dist/luan_an_ctu/00_phan_dau_vi.docx
@@ -262,7 +262,7 @@
         <w:pStyle w:val="BodyText"/>
       </w:pPr>
       <w:r>
-        <w:t xml:space="preserve">Luận án sử dụng thiết kế hỗn hợp tổng hợp–thực nghiệm (mixed synthesis-empirical): (i) một phân tích tổng hợp (meta-analysis) ba tầng giai đoạn 1982–2026 với k = 238 nghiên cứu; và (ii) phân tích thực nghiệm dữ liệu doanh nghiệp từ Khảo sát Doanh nghiệp của Ngân hàng Thế giới (WBES) trên 49 nền kinh tế châu Á và Thái Bình Dương (mẫu phân tích chính N = 91.982 doanh nghiệp), bổ sung bằng các phân tích quốc gia chuyên sâu (Việt Nam, Singapore, Trung Quốc) và trường hợp biên là bảy nền kinh tế đảo nhỏ đang phát triển (SIDS) Thái Bình Dương.</w:t>
+        <w:t xml:space="preserve">Luận án sử dụng thiết kế hỗn hợp tổng hợp–thực nghiệm (mixed synthesis-empirical): (i) một phân tích tổng hợp (meta-analysis) ba tầng giai đoạn 1982–2026 với k = 238 nghiên cứu; và (ii) phân tích thực nghiệm dữ liệu doanh nghiệp từ Khảo sát Doanh nghiệp của Ngân hàng Thế giới (WBES) trên 49 nền kinh tế châu Á và Thái Bình Dương (mẫu phân tích chính N = 91.982 doanh nghiệp), bổ sung bằng các phân tích quốc gia chuyên sâu (Việt Nam, Singapore, Trung Quốc, Ấn Độ) và trường hợp biên là bảy nền kinh tế đảo nhỏ đang phát triển (SIDS) Thái Bình Dương.</w:t>
       </w:r>
     </w:p>
     <w:p>
@@ -334,7 +334,7 @@
         <w:pStyle w:val="BodyText"/>
       </w:pPr>
       <w:r>
-        <w:t xml:space="preserve">The study adopts a mixed synthesis-empirical design: (i) a three-level meta-analysis spanning 1982–2026 (k = 238 studies); and (ii) firm-level empirical analysis of World Bank Enterprise Survey (WBES) microdata across 49 Asian and Pacific economies (main analytic sample N = 91,982 firms), complemented by country-specific analyses (Vietnam, Singapore, China) and a boundary case of seven Pacific Small Island Developing States (SIDS).</w:t>
+        <w:t xml:space="preserve">The study adopts a mixed synthesis-empirical design: (i) a three-level meta-analysis spanning 1982–2026 (k = 238 studies); and (ii) firm-level empirical analysis of World Bank Enterprise Survey (WBES) microdata across 49 Asian and Pacific economies (main analytic sample N = 91,982 firms), complemented by country-specific analyses (Vietnam, Singapore, China, India) and a boundary case of seven Pacific Small Island Developing States (SIDS).</w:t>
       </w:r>
     </w:p>
     <w:p>
@@ -1809,7 +1809,7 @@
         <w:pStyle w:val="FirstParagraph"/>
       </w:pPr>
       <w:r>
-        <w:t xml:space="preserve">Luận án được phát triển gắn với chuỗi nghiên cứu thành phần (ký hiệu nội bộ P1–P8) của nghiên cứu sinh. Các công trình được phân tách rõ theo trạng thái công bố.</w:t>
+        <w:t xml:space="preserve">Luận án được phát triển gắn với chuỗi nghiên cứu thành phần (ký hiệu nội bộ P1–P9) của nghiên cứu sinh. Các công trình được phân tách rõ theo trạng thái công bố.</w:t>
       </w:r>
     </w:p>
     <w:p>
@@ -1905,7 +1905,30 @@
           <w:iCs/>
           <w:i/>
         </w:rPr>
-        <w:t xml:space="preserve">(Chương sách bình duyệt — bằng chứng country-level India về vai trò điều tiết của đặc điểm nhà quản trị cấp cao; gắn với tầng thượng tầng quản trị/H4 của luận án.)</w:t>
+        <w:t xml:space="preserve">(</w:t>
+      </w:r>
+      <w:r>
+        <w:rPr>
+          <w:bCs/>
+          <w:b/>
+          <w:iCs/>
+          <w:i/>
+        </w:rPr>
+        <w:t xml:space="preserve">P9</w:t>
+      </w:r>
+      <w:r>
+        <w:rPr>
+          <w:iCs/>
+          <w:i/>
+        </w:rPr>
+        <w:t xml:space="preserve"> </w:t>
+      </w:r>
+      <w:r>
+        <w:rPr>
+          <w:iCs/>
+          <w:i/>
+        </w:rPr>
+        <w:t xml:space="preserve">— đã công bố, dữ liệu đến 2025; bằng chứng country-level Ấn Độ (380 doanh nghiệp WBES, ước lượng FGLS) về vai trò điều tiết của đặc điểm nhà quản trị cấp cao — gắn với tầng thượng tầng quản trị/H4 của luận án.)</w:t>
       </w:r>
     </w:p>
     <w:p>
@@ -2131,7 +2154,7 @@
           <w:iCs/>
           <w:i/>
         </w:rPr>
-        <w:t xml:space="preserve">Ghi chú về liêm chính học thuật: Theo định hướng luận án kết hợp công trình thành phần, các nghiên cứu P1–P8 là một phần nội dung nghiên cứu của chính luận án; do đó trong các chương, chúng được dẫn chiếu bằng nhãn nội bộ (P1–P8) thay vì trích dẫn tác giả–năm. Các bản thảo ở mục B CHƯA được công bố/bình duyệt chính thức, không được diễn giải như bằng chứng đã qua bình duyệt độc lập; tên tạp chí mục tiêu chỉ được nêu chính thức sau khi bài được chấp nhận. NCS cập nhật trạng thái tại thời điểm bảo vệ.</w:t>
+        <w:t xml:space="preserve">Ghi chú về liêm chính học thuật: Theo định hướng luận án kết hợp công trình thành phần, các nghiên cứu P1–P9 là một phần nội dung nghiên cứu của chính luận án; do đó trong các chương, chúng được dẫn chiếu bằng nhãn nội bộ (P1–P9) thay vì trích dẫn tác giả–năm. Các bản thảo ở mục B CHƯA được công bố/bình duyệt chính thức, không được diễn giải như bằng chứng đã qua bình duyệt độc lập; tên tạp chí mục tiêu chỉ được nêu chính thức sau khi bài được chấp nhận. NCS cập nhật trạng thái tại thời điểm bảo vệ.</w:t>
       </w:r>
     </w:p>
     <w:p>

</xml_diff>

<commit_message>
docs(dissertation): add author's published related I-P works (Turkey x2, Poland) + fix meta-analysis year
Per Google Scholar, added the author's other published internationalization-performance works to the
publications list (new section C) and APA-7 references, and cited them at H4 (managerial-moderator tier):
- Phan, Do & Phan (2020, Accounting) - Turkey (from the master's thesis); already in refs.
- Le, Do & Phan (2021) - Turkey, managerial personality (outlet to confirm).
- Phan et al. (2021, PalArch's) - Poland, manager characteristics + financial obstacles.
Also corrected the baseline meta-analysis entry to 2025 (ICBEF 2024 proceedings). docx rebuilt.
</commit_message>
<xml_diff>
--- a/dist/luan_an_ctu/00_phan_dau_vi.docx
+++ b/dist/luan_an_ctu/00_phan_dau_vi.docx
@@ -30,7 +30,7 @@
         <w:t xml:space="preserve">─────────────────────────────────────────</w:t>
       </w:r>
     </w:p>
-    <w:bookmarkStart w:id="31" w:name="đỗ-thùy-hương"/>
+    <w:bookmarkStart w:id="32" w:name="đỗ-thùy-hương"/>
     <w:p>
       <w:pPr>
         <w:pStyle w:val="Heading1"/>
@@ -1795,7 +1795,7 @@
       </w:r>
     </w:p>
     <w:bookmarkEnd w:id="28"/>
-    <w:bookmarkStart w:id="30" w:name="X3131bb7fa4eac4deea1bc52d0a917d3422a5919"/>
+    <w:bookmarkStart w:id="31" w:name="X3131bb7fa4eac4deea1bc52d0a917d3422a5919"/>
     <w:p>
       <w:pPr>
         <w:pStyle w:val="Heading2"/>
@@ -1833,7 +1833,7 @@
         <w:pStyle w:val="Compact"/>
       </w:pPr>
       <w:r>
-        <w:t xml:space="preserve">Do, T. H., &amp; Phan, A. T. (2024, December).</w:t>
+        <w:t xml:space="preserve">Do, T. H., &amp; Phan, A. T. (2025). Internationalization and firm performance: A meta-analysis review. In</w:t>
       </w:r>
       <w:r>
         <w:t xml:space="preserve"> </w:t>
@@ -1843,13 +1843,10 @@
           <w:iCs/>
           <w:i/>
         </w:rPr>
-        <w:t xml:space="preserve">Internationalization and firm performance: A meta-analysis review</w:t>
-      </w:r>
-      <w:r>
-        <w:t xml:space="preserve"> </w:t>
-      </w:r>
-      <w:r>
-        <w:t xml:space="preserve">[Paper presentation]. The Sixth International Conference on Sustainable Development in Economics, Business, and Finance (ICBEF), Can Tho University, Vietnam.</w:t>
+        <w:t xml:space="preserve">Proceedings of the Sixth International Conference on Sustainable Development in Economics, Business, and Finance (ICBEF 2024)</w:t>
+      </w:r>
+      <w:r>
+        <w:t xml:space="preserve">. Can Tho University, Vietnam.</w:t>
       </w:r>
       <w:r>
         <w:t xml:space="preserve"> </w:t>
@@ -1859,7 +1856,7 @@
           <w:iCs/>
           <w:i/>
         </w:rPr>
-        <w:t xml:space="preserve">(Cơ sở baseline meta-analysis — P1/P2.)</w:t>
+        <w:t xml:space="preserve">(Cơ sở baseline meta-analysis — k = 113; nền tảng cho P1/P2/P6.)</w:t>
       </w:r>
     </w:p>
     <w:p>
@@ -2166,6 +2163,134 @@
       </w:pPr>
       <w:r>
         <w:rPr>
+          <w:bCs/>
+          <w:b/>
+        </w:rPr>
+        <w:t xml:space="preserve">C. Công trình liên quan khác đã công bố (cùng hướng quốc tế hóa–hiệu quả, được trích dẫn trong luận án)</w:t>
+      </w:r>
+    </w:p>
+    <w:p>
+      <w:pPr>
+        <w:numPr>
+          <w:ilvl w:val="0"/>
+          <w:numId w:val="1005"/>
+        </w:numPr>
+        <w:pStyle w:val="Compact"/>
+      </w:pPr>
+      <w:r>
+        <w:t xml:space="preserve">Phan, A. T., Do, T. H., &amp; Phan, M. T. (2020). The moderating effects of managers' experience and gender on internationalization and firm performance of manufacturing enterprises in Turkey.</w:t>
+      </w:r>
+      <w:r>
+        <w:t xml:space="preserve"> </w:t>
+      </w:r>
+      <w:r>
+        <w:rPr>
+          <w:iCs/>
+          <w:i/>
+        </w:rPr>
+        <w:t xml:space="preserve">Accounting, 6</w:t>
+      </w:r>
+      <w:r>
+        <w:t xml:space="preserve">(7), 1209–1216.</w:t>
+      </w:r>
+      <w:r>
+        <w:t xml:space="preserve"> </w:t>
+      </w:r>
+      <w:hyperlink r:id="rId30">
+        <w:r>
+          <w:rPr>
+            <w:rStyle w:val="Hyperlink"/>
+          </w:rPr>
+          <w:t xml:space="preserve">https://doi.org/10.5267/j.ac.2020.9.006</w:t>
+        </w:r>
+      </w:hyperlink>
+      <w:r>
+        <w:t xml:space="preserve"> </w:t>
+      </w:r>
+      <w:r>
+        <w:rPr>
+          <w:iCs/>
+          <w:i/>
+        </w:rPr>
+        <w:t xml:space="preserve">(Thổ Nhĩ Kỳ — nền tảng từ luận văn thạc sĩ về điều tiết của đặc điểm nhà quản trị; được trích ở H4.)</w:t>
+      </w:r>
+    </w:p>
+    <w:p>
+      <w:pPr>
+        <w:numPr>
+          <w:ilvl w:val="0"/>
+          <w:numId w:val="1005"/>
+        </w:numPr>
+        <w:pStyle w:val="Compact"/>
+      </w:pPr>
+      <w:r>
+        <w:t xml:space="preserve">Le, K. N., Do, T. H., &amp; Phan, A. T. (2021). Internationalization and Turkish manufacturing firm performance: Does managerial personality matter?</w:t>
+      </w:r>
+      <w:r>
+        <w:t xml:space="preserve"> </w:t>
+      </w:r>
+      <w:r>
+        <w:rPr>
+          <w:iCs/>
+          <w:i/>
+        </w:rPr>
+        <w:t xml:space="preserve">[Tên ấn phẩm — NCS xác nhận]</w:t>
+      </w:r>
+      <w:r>
+        <w:t xml:space="preserve">.</w:t>
+      </w:r>
+      <w:r>
+        <w:t xml:space="preserve"> </w:t>
+      </w:r>
+      <w:r>
+        <w:rPr>
+          <w:iCs/>
+          <w:i/>
+        </w:rPr>
+        <w:t xml:space="preserve">(Thổ Nhĩ Kỳ — tính cách nhà quản trị.)</w:t>
+      </w:r>
+    </w:p>
+    <w:p>
+      <w:pPr>
+        <w:numPr>
+          <w:ilvl w:val="0"/>
+          <w:numId w:val="1005"/>
+        </w:numPr>
+        <w:pStyle w:val="Compact"/>
+      </w:pPr>
+      <w:r>
+        <w:t xml:space="preserve">Phan, A. T., Van Song, N., Van Tien, D., Van Ha, T., Tiep, N. C., Thang, D. Q., et al. (2021). The moderating effects of the manager's characteristics and financial obstacles on internationalization and firm performance in Poland.</w:t>
+      </w:r>
+      <w:r>
+        <w:t xml:space="preserve"> </w:t>
+      </w:r>
+      <w:r>
+        <w:rPr>
+          <w:iCs/>
+          <w:i/>
+        </w:rPr>
+        <w:t xml:space="preserve">PalArch's Journal of Archaeology of Egypt/Egyptology, 18</w:t>
+      </w:r>
+      <w:r>
+        <w:t xml:space="preserve">(4), 4063–4081.</w:t>
+      </w:r>
+      <w:r>
+        <w:t xml:space="preserve"> </w:t>
+      </w:r>
+      <w:r>
+        <w:rPr>
+          <w:iCs/>
+          <w:i/>
+        </w:rPr>
+        <w:t xml:space="preserve">(Ba Lan — đặc điểm nhà quản trị và rào cản tài chính điều tiết I–P; được trích ở H4.)</w:t>
+      </w:r>
+    </w:p>
+    <w:p>
+      <w:pPr>
+        <w:pStyle w:val="FirstParagraph"/>
+      </w:pPr>
+      <w:r>
+        <w:rPr>
           <w:iCs/>
           <w:i/>
         </w:rPr>
@@ -2179,8 +2304,8 @@
         </w:pict>
       </w:r>
     </w:p>
-    <w:bookmarkEnd w:id="30"/>
     <w:bookmarkEnd w:id="31"/>
+    <w:bookmarkEnd w:id="32"/>
     <w:sectPr>
       <w:pgSz w:h="16838" w:w="11906"/>
       <w:pgMar w:bottom="1134" w:left="1701" w:right="1134" w:top="1134"/>
@@ -2528,6 +2653,91 @@
     </w:lvl>
     <w:lvl w:ilvl="8">
       <w:start w:val="5"/>
+      <w:numFmt w:val="decimal"/>
+      <w:lvlText w:val="%9."/>
+      <w:lvlJc w:val="left"/>
+      <w:pPr>
+        <w:ind w:left="6480" w:hanging="480"/>
+      </w:pPr>
+    </w:lvl>
+  </w:abstractNum>
+  <w:abstractNum w:abstractNumId="994112">
+    <w:nsid w:val="A994112"/>
+    <w:multiLevelType w:val="multilevel"/>
+    <w:lvl w:ilvl="0">
+      <w:start w:val="12"/>
+      <w:numFmt w:val="decimal"/>
+      <w:lvlText w:val="%1."/>
+      <w:lvlJc w:val="left"/>
+      <w:pPr>
+        <w:ind w:left="720" w:hanging="480"/>
+      </w:pPr>
+    </w:lvl>
+    <w:lvl w:ilvl="1">
+      <w:start w:val="12"/>
+      <w:numFmt w:val="decimal"/>
+      <w:lvlText w:val="%2."/>
+      <w:lvlJc w:val="left"/>
+      <w:pPr>
+        <w:ind w:left="1440" w:hanging="480"/>
+      </w:pPr>
+    </w:lvl>
+    <w:lvl w:ilvl="2">
+      <w:start w:val="12"/>
+      <w:numFmt w:val="decimal"/>
+      <w:lvlText w:val="%3."/>
+      <w:lvlJc w:val="left"/>
+      <w:pPr>
+        <w:ind w:left="2160" w:hanging="480"/>
+      </w:pPr>
+    </w:lvl>
+    <w:lvl w:ilvl="3">
+      <w:start w:val="12"/>
+      <w:numFmt w:val="decimal"/>
+      <w:lvlText w:val="%4."/>
+      <w:lvlJc w:val="left"/>
+      <w:pPr>
+        <w:ind w:left="2880" w:hanging="480"/>
+      </w:pPr>
+    </w:lvl>
+    <w:lvl w:ilvl="4">
+      <w:start w:val="12"/>
+      <w:numFmt w:val="decimal"/>
+      <w:lvlText w:val="%5."/>
+      <w:lvlJc w:val="left"/>
+      <w:pPr>
+        <w:ind w:left="3600" w:hanging="480"/>
+      </w:pPr>
+    </w:lvl>
+    <w:lvl w:ilvl="5">
+      <w:start w:val="12"/>
+      <w:numFmt w:val="decimal"/>
+      <w:lvlText w:val="%6."/>
+      <w:lvlJc w:val="left"/>
+      <w:pPr>
+        <w:ind w:left="4320" w:hanging="480"/>
+      </w:pPr>
+    </w:lvl>
+    <w:lvl w:ilvl="6">
+      <w:start w:val="12"/>
+      <w:numFmt w:val="decimal"/>
+      <w:lvlText w:val="%7."/>
+      <w:lvlJc w:val="left"/>
+      <w:pPr>
+        <w:ind w:left="5040" w:hanging="480"/>
+      </w:pPr>
+    </w:lvl>
+    <w:lvl w:ilvl="7">
+      <w:start w:val="12"/>
+      <w:numFmt w:val="decimal"/>
+      <w:lvlText w:val="%8."/>
+      <w:lvlJc w:val="left"/>
+      <w:pPr>
+        <w:ind w:left="5760" w:hanging="480"/>
+      </w:pPr>
+    </w:lvl>
+    <w:lvl w:ilvl="8">
+      <w:start w:val="12"/>
       <w:numFmt w:val="decimal"/>
       <w:lvlText w:val="%9."/>
       <w:lvlJc w:val="left"/>
@@ -2603,6 +2813,36 @@
     </w:lvlOverride>
     <w:lvlOverride w:ilvl="8">
       <w:startOverride w:val="5"/>
+    </w:lvlOverride>
+  </w:num>
+  <w:num w:numId="1005">
+    <w:abstractNumId w:val="994112"/>
+    <w:lvlOverride w:ilvl="0">
+      <w:startOverride w:val="12"/>
+    </w:lvlOverride>
+    <w:lvlOverride w:ilvl="1">
+      <w:startOverride w:val="12"/>
+    </w:lvlOverride>
+    <w:lvlOverride w:ilvl="2">
+      <w:startOverride w:val="12"/>
+    </w:lvlOverride>
+    <w:lvlOverride w:ilvl="3">
+      <w:startOverride w:val="12"/>
+    </w:lvlOverride>
+    <w:lvlOverride w:ilvl="4">
+      <w:startOverride w:val="12"/>
+    </w:lvlOverride>
+    <w:lvlOverride w:ilvl="5">
+      <w:startOverride w:val="12"/>
+    </w:lvlOverride>
+    <w:lvlOverride w:ilvl="6">
+      <w:startOverride w:val="12"/>
+    </w:lvlOverride>
+    <w:lvlOverride w:ilvl="7">
+      <w:startOverride w:val="12"/>
+    </w:lvlOverride>
+    <w:lvlOverride w:ilvl="8">
+      <w:startOverride w:val="12"/>
     </w:lvlOverride>
   </w:num>
 </w:numbering>

</xml_diff>

<commit_message>
docs: annotate Turkey paper as master's-thesis-derived; flag Poland author list for author verification
</commit_message>
<xml_diff>
--- a/dist/luan_an_ctu/00_phan_dau_vi.docx
+++ b/dist/luan_an_ctu/00_phan_dau_vi.docx
@@ -2212,7 +2212,30 @@
           <w:iCs/>
           <w:i/>
         </w:rPr>
-        <w:t xml:space="preserve">(Thổ Nhĩ Kỳ — nền tảng từ luận văn thạc sĩ về điều tiết của đặc điểm nhà quản trị; được trích ở H4.)</w:t>
+        <w:t xml:space="preserve">(Thổ Nhĩ Kỳ — bài báo</w:t>
+      </w:r>
+      <w:r>
+        <w:rPr>
+          <w:iCs/>
+          <w:i/>
+        </w:rPr>
+        <w:t xml:space="preserve"> </w:t>
+      </w:r>
+      <w:r>
+        <w:rPr>
+          <w:bCs/>
+          <w:b/>
+          <w:iCs/>
+          <w:i/>
+        </w:rPr>
+        <w:t xml:space="preserve">phát triển từ luận văn thạc sĩ của NCS</w:t>
+      </w:r>
+      <w:r>
+        <w:rPr>
+          <w:iCs/>
+          <w:i/>
+        </w:rPr>
+        <w:t xml:space="preserve">; điều tiết của kinh nghiệm và giới tính nhà quản trị lên I–P; 5 trích dẫn; được trích ở H4.)</w:t>
       </w:r>
     </w:p>
     <w:p>
@@ -2282,7 +2305,7 @@
           <w:iCs/>
           <w:i/>
         </w:rPr>
-        <w:t xml:space="preserve">(Ba Lan — đặc điểm nhà quản trị và rào cản tài chính điều tiết I–P; được trích ở H4.)</w:t>
+        <w:t xml:space="preserve">(Ba Lan — đặc điểm nhà quản trị và rào cản tài chính điều tiết I–P; 2 trích dẫn; được trích ở H4. NCS bổ sung đầy đủ danh sách tác giả từ bản gốc — Google Scholar rút gọn bằng "…".)</w:t>
       </w:r>
     </w:p>
     <w:p>

</xml_diff>

<commit_message>
docs: Turkey/Poland papers as in-text citations only (not in candidate's publications list)
Per author instruction, the Turkey (Accounting 2020, MSc-derived) and Poland (PalArch 2021) papers are
used as supporting citations at the H4 managerial-moderator argument (chuong_2 2.5.5) and kept in the
APA-7 reference list, but removed from the dissertation's 'Danh muc cong trinh cua NCS' (which now lists
only the actual components: meta + India book chapter + P1/P2 published; P3-P9 under review). Removed the
orphan Turkey#2 reference (unknown outlet, not cited). docx rebuilt.
</commit_message>
<xml_diff>
--- a/dist/luan_an_ctu/00_phan_dau_vi.docx
+++ b/dist/luan_an_ctu/00_phan_dau_vi.docx
@@ -30,7 +30,7 @@
         <w:t xml:space="preserve">─────────────────────────────────────────</w:t>
       </w:r>
     </w:p>
-    <w:bookmarkStart w:id="32" w:name="đỗ-thùy-hương"/>
+    <w:bookmarkStart w:id="31" w:name="đỗ-thùy-hương"/>
     <w:p>
       <w:pPr>
         <w:pStyle w:val="Heading1"/>
@@ -1795,7 +1795,7 @@
       </w:r>
     </w:p>
     <w:bookmarkEnd w:id="28"/>
-    <w:bookmarkStart w:id="31" w:name="X3131bb7fa4eac4deea1bc52d0a917d3422a5919"/>
+    <w:bookmarkStart w:id="30" w:name="X3131bb7fa4eac4deea1bc52d0a917d3422a5919"/>
     <w:p>
       <w:pPr>
         <w:pStyle w:val="Heading2"/>
@@ -2163,157 +2163,6 @@
       </w:pPr>
       <w:r>
         <w:rPr>
-          <w:bCs/>
-          <w:b/>
-        </w:rPr>
-        <w:t xml:space="preserve">C. Công trình liên quan khác đã công bố (cùng hướng quốc tế hóa–hiệu quả, được trích dẫn trong luận án)</w:t>
-      </w:r>
-    </w:p>
-    <w:p>
-      <w:pPr>
-        <w:numPr>
-          <w:ilvl w:val="0"/>
-          <w:numId w:val="1005"/>
-        </w:numPr>
-        <w:pStyle w:val="Compact"/>
-      </w:pPr>
-      <w:r>
-        <w:t xml:space="preserve">Phan, A. T., Do, T. H., &amp; Phan, M. T. (2020). The moderating effects of managers' experience and gender on internationalization and firm performance of manufacturing enterprises in Turkey.</w:t>
-      </w:r>
-      <w:r>
-        <w:t xml:space="preserve"> </w:t>
-      </w:r>
-      <w:r>
-        <w:rPr>
-          <w:iCs/>
-          <w:i/>
-        </w:rPr>
-        <w:t xml:space="preserve">Accounting, 6</w:t>
-      </w:r>
-      <w:r>
-        <w:t xml:space="preserve">(7), 1209–1216.</w:t>
-      </w:r>
-      <w:r>
-        <w:t xml:space="preserve"> </w:t>
-      </w:r>
-      <w:hyperlink r:id="rId30">
-        <w:r>
-          <w:rPr>
-            <w:rStyle w:val="Hyperlink"/>
-          </w:rPr>
-          <w:t xml:space="preserve">https://doi.org/10.5267/j.ac.2020.9.006</w:t>
-        </w:r>
-      </w:hyperlink>
-      <w:r>
-        <w:t xml:space="preserve"> </w:t>
-      </w:r>
-      <w:r>
-        <w:rPr>
-          <w:iCs/>
-          <w:i/>
-        </w:rPr>
-        <w:t xml:space="preserve">(Thổ Nhĩ Kỳ — bài báo</w:t>
-      </w:r>
-      <w:r>
-        <w:rPr>
-          <w:iCs/>
-          <w:i/>
-        </w:rPr>
-        <w:t xml:space="preserve"> </w:t>
-      </w:r>
-      <w:r>
-        <w:rPr>
-          <w:bCs/>
-          <w:b/>
-          <w:iCs/>
-          <w:i/>
-        </w:rPr>
-        <w:t xml:space="preserve">phát triển từ luận văn thạc sĩ của NCS</w:t>
-      </w:r>
-      <w:r>
-        <w:rPr>
-          <w:iCs/>
-          <w:i/>
-        </w:rPr>
-        <w:t xml:space="preserve">; điều tiết của kinh nghiệm và giới tính nhà quản trị lên I–P; 5 trích dẫn; được trích ở H4.)</w:t>
-      </w:r>
-    </w:p>
-    <w:p>
-      <w:pPr>
-        <w:numPr>
-          <w:ilvl w:val="0"/>
-          <w:numId w:val="1005"/>
-        </w:numPr>
-        <w:pStyle w:val="Compact"/>
-      </w:pPr>
-      <w:r>
-        <w:t xml:space="preserve">Le, K. N., Do, T. H., &amp; Phan, A. T. (2021). Internationalization and Turkish manufacturing firm performance: Does managerial personality matter?</w:t>
-      </w:r>
-      <w:r>
-        <w:t xml:space="preserve"> </w:t>
-      </w:r>
-      <w:r>
-        <w:rPr>
-          <w:iCs/>
-          <w:i/>
-        </w:rPr>
-        <w:t xml:space="preserve">[Tên ấn phẩm — NCS xác nhận]</w:t>
-      </w:r>
-      <w:r>
-        <w:t xml:space="preserve">.</w:t>
-      </w:r>
-      <w:r>
-        <w:t xml:space="preserve"> </w:t>
-      </w:r>
-      <w:r>
-        <w:rPr>
-          <w:iCs/>
-          <w:i/>
-        </w:rPr>
-        <w:t xml:space="preserve">(Thổ Nhĩ Kỳ — tính cách nhà quản trị.)</w:t>
-      </w:r>
-    </w:p>
-    <w:p>
-      <w:pPr>
-        <w:numPr>
-          <w:ilvl w:val="0"/>
-          <w:numId w:val="1005"/>
-        </w:numPr>
-        <w:pStyle w:val="Compact"/>
-      </w:pPr>
-      <w:r>
-        <w:t xml:space="preserve">Phan, A. T., Van Song, N., Van Tien, D., Van Ha, T., Tiep, N. C., Thang, D. Q., et al. (2021). The moderating effects of the manager's characteristics and financial obstacles on internationalization and firm performance in Poland.</w:t>
-      </w:r>
-      <w:r>
-        <w:t xml:space="preserve"> </w:t>
-      </w:r>
-      <w:r>
-        <w:rPr>
-          <w:iCs/>
-          <w:i/>
-        </w:rPr>
-        <w:t xml:space="preserve">PalArch's Journal of Archaeology of Egypt/Egyptology, 18</w:t>
-      </w:r>
-      <w:r>
-        <w:t xml:space="preserve">(4), 4063–4081.</w:t>
-      </w:r>
-      <w:r>
-        <w:t xml:space="preserve"> </w:t>
-      </w:r>
-      <w:r>
-        <w:rPr>
-          <w:iCs/>
-          <w:i/>
-        </w:rPr>
-        <w:t xml:space="preserve">(Ba Lan — đặc điểm nhà quản trị và rào cản tài chính điều tiết I–P; 2 trích dẫn; được trích ở H4. NCS bổ sung đầy đủ danh sách tác giả từ bản gốc — Google Scholar rút gọn bằng "…".)</w:t>
-      </w:r>
-    </w:p>
-    <w:p>
-      <w:pPr>
-        <w:pStyle w:val="FirstParagraph"/>
-      </w:pPr>
-      <w:r>
-        <w:rPr>
           <w:iCs/>
           <w:i/>
         </w:rPr>
@@ -2327,8 +2176,8 @@
         </w:pict>
       </w:r>
     </w:p>
+    <w:bookmarkEnd w:id="30"/>
     <w:bookmarkEnd w:id="31"/>
-    <w:bookmarkEnd w:id="32"/>
     <w:sectPr>
       <w:pgSz w:h="16838" w:w="11906"/>
       <w:pgMar w:bottom="1134" w:left="1701" w:right="1134" w:top="1134"/>
@@ -2676,91 +2525,6 @@
     </w:lvl>
     <w:lvl w:ilvl="8">
       <w:start w:val="5"/>
-      <w:numFmt w:val="decimal"/>
-      <w:lvlText w:val="%9."/>
-      <w:lvlJc w:val="left"/>
-      <w:pPr>
-        <w:ind w:left="6480" w:hanging="480"/>
-      </w:pPr>
-    </w:lvl>
-  </w:abstractNum>
-  <w:abstractNum w:abstractNumId="994112">
-    <w:nsid w:val="A994112"/>
-    <w:multiLevelType w:val="multilevel"/>
-    <w:lvl w:ilvl="0">
-      <w:start w:val="12"/>
-      <w:numFmt w:val="decimal"/>
-      <w:lvlText w:val="%1."/>
-      <w:lvlJc w:val="left"/>
-      <w:pPr>
-        <w:ind w:left="720" w:hanging="480"/>
-      </w:pPr>
-    </w:lvl>
-    <w:lvl w:ilvl="1">
-      <w:start w:val="12"/>
-      <w:numFmt w:val="decimal"/>
-      <w:lvlText w:val="%2."/>
-      <w:lvlJc w:val="left"/>
-      <w:pPr>
-        <w:ind w:left="1440" w:hanging="480"/>
-      </w:pPr>
-    </w:lvl>
-    <w:lvl w:ilvl="2">
-      <w:start w:val="12"/>
-      <w:numFmt w:val="decimal"/>
-      <w:lvlText w:val="%3."/>
-      <w:lvlJc w:val="left"/>
-      <w:pPr>
-        <w:ind w:left="2160" w:hanging="480"/>
-      </w:pPr>
-    </w:lvl>
-    <w:lvl w:ilvl="3">
-      <w:start w:val="12"/>
-      <w:numFmt w:val="decimal"/>
-      <w:lvlText w:val="%4."/>
-      <w:lvlJc w:val="left"/>
-      <w:pPr>
-        <w:ind w:left="2880" w:hanging="480"/>
-      </w:pPr>
-    </w:lvl>
-    <w:lvl w:ilvl="4">
-      <w:start w:val="12"/>
-      <w:numFmt w:val="decimal"/>
-      <w:lvlText w:val="%5."/>
-      <w:lvlJc w:val="left"/>
-      <w:pPr>
-        <w:ind w:left="3600" w:hanging="480"/>
-      </w:pPr>
-    </w:lvl>
-    <w:lvl w:ilvl="5">
-      <w:start w:val="12"/>
-      <w:numFmt w:val="decimal"/>
-      <w:lvlText w:val="%6."/>
-      <w:lvlJc w:val="left"/>
-      <w:pPr>
-        <w:ind w:left="4320" w:hanging="480"/>
-      </w:pPr>
-    </w:lvl>
-    <w:lvl w:ilvl="6">
-      <w:start w:val="12"/>
-      <w:numFmt w:val="decimal"/>
-      <w:lvlText w:val="%7."/>
-      <w:lvlJc w:val="left"/>
-      <w:pPr>
-        <w:ind w:left="5040" w:hanging="480"/>
-      </w:pPr>
-    </w:lvl>
-    <w:lvl w:ilvl="7">
-      <w:start w:val="12"/>
-      <w:numFmt w:val="decimal"/>
-      <w:lvlText w:val="%8."/>
-      <w:lvlJc w:val="left"/>
-      <w:pPr>
-        <w:ind w:left="5760" w:hanging="480"/>
-      </w:pPr>
-    </w:lvl>
-    <w:lvl w:ilvl="8">
-      <w:start w:val="12"/>
       <w:numFmt w:val="decimal"/>
       <w:lvlText w:val="%9."/>
       <w:lvlJc w:val="left"/>
@@ -2836,36 +2600,6 @@
     </w:lvlOverride>
     <w:lvlOverride w:ilvl="8">
       <w:startOverride w:val="5"/>
-    </w:lvlOverride>
-  </w:num>
-  <w:num w:numId="1005">
-    <w:abstractNumId w:val="994112"/>
-    <w:lvlOverride w:ilvl="0">
-      <w:startOverride w:val="12"/>
-    </w:lvlOverride>
-    <w:lvlOverride w:ilvl="1">
-      <w:startOverride w:val="12"/>
-    </w:lvlOverride>
-    <w:lvlOverride w:ilvl="2">
-      <w:startOverride w:val="12"/>
-    </w:lvlOverride>
-    <w:lvlOverride w:ilvl="3">
-      <w:startOverride w:val="12"/>
-    </w:lvlOverride>
-    <w:lvlOverride w:ilvl="4">
-      <w:startOverride w:val="12"/>
-    </w:lvlOverride>
-    <w:lvlOverride w:ilvl="5">
-      <w:startOverride w:val="12"/>
-    </w:lvlOverride>
-    <w:lvlOverride w:ilvl="6">
-      <w:startOverride w:val="12"/>
-    </w:lvlOverride>
-    <w:lvlOverride w:ilvl="7">
-      <w:startOverride w:val="12"/>
-    </w:lvlOverride>
-    <w:lvlOverride w:ilvl="8">
-      <w:startOverride w:val="12"/>
     </w:lvlOverride>
   </w:num>
 </w:numbering>

</xml_diff>

<commit_message>
docs(front-matter): real DANH MỤC BẢNG/HÌNH (4 numbered + 7 section tables; Hình 4.x→4.1), regen docx
</commit_message>
<xml_diff>
--- a/dist/luan_an_ctu/00_phan_dau_vi.docx
+++ b/dist/luan_an_ctu/00_phan_dau_vi.docx
@@ -30,7 +30,7 @@
         <w:t xml:space="preserve">─────────────────────────────────────────</w:t>
       </w:r>
     </w:p>
-    <w:bookmarkStart w:id="31" w:name="đỗ-thùy-hương"/>
+    <w:bookmarkStart w:id="21" w:name="đỗ-thùy-hương"/>
     <w:p>
       <w:pPr>
         <w:pStyle w:val="Heading1"/>
@@ -114,6 +114,8 @@
         <w:t xml:space="preserve">Cần Thơ, năm 2026</w:t>
       </w:r>
     </w:p>
+    <w:bookmarkEnd w:id="20"/>
+    <w:bookmarkEnd w:id="21"/>
     <w:p>
       <w:r>
         <w:pict>
@@ -121,8 +123,7 @@
         </w:pict>
       </w:r>
     </w:p>
-    <w:bookmarkEnd w:id="20"/>
-    <w:bookmarkStart w:id="21" w:name="lời-cam-đoan"/>
+    <w:bookmarkStart w:id="22" w:name="lời-cam-đoan"/>
     <w:p>
       <w:pPr>
         <w:pStyle w:val="Heading2"/>
@@ -210,8 +211,8 @@
         </w:pict>
       </w:r>
     </w:p>
-    <w:bookmarkEnd w:id="21"/>
-    <w:bookmarkStart w:id="22" w:name="lời-cảm-ơn"/>
+    <w:bookmarkEnd w:id="22"/>
+    <w:bookmarkStart w:id="23" w:name="lời-cảm-ơn"/>
     <w:p>
       <w:pPr>
         <w:pStyle w:val="Heading2"/>
@@ -239,8 +240,8 @@
         </w:pict>
       </w:r>
     </w:p>
-    <w:bookmarkEnd w:id="22"/>
-    <w:bookmarkStart w:id="23" w:name="tóm-tắt"/>
+    <w:bookmarkEnd w:id="23"/>
+    <w:bookmarkStart w:id="24" w:name="tóm-tắt"/>
     <w:p>
       <w:pPr>
         <w:pStyle w:val="Heading2"/>
@@ -270,7 +271,22 @@
         <w:pStyle w:val="BodyText"/>
       </w:pPr>
       <w:r>
-        <w:t xml:space="preserve">Kết quả chính: (1) quan hệ I–P có dạng phi tuyến chữ U ngược, nhưng điểm uốn (turning point) không cố định mà giảm dần theo chất lượng thể chế — từ khoảng 55% cường độ xuất khẩu ở các nền kinh tế thể chế yếu xuống khoảng 28% ở các nền kinh tế thể chế mạnh; (2) TCI là năng lực nền tảng nâng mặt bằng hiệu quả phổ quát, trong khi DAI là nguồn lực tình huống làm thay đổi độ cong đường quan hệ và phát huy mạnh hơn ở môi trường thể chế yếu (hiệu ứng "lá chắn số"); (3) tại nhóm SIDS, quan hệ I–P chuyển thành âm đơn điệu không có điểm uốn — hiện tượng được luận án đặt tên là</w:t>
+        <w:t xml:space="preserve">Kết quả chính: (1) quan hệ I–P có dạng phi tuyến chữ U ngược, nhưng điểm uốn (turning point) không cố định mà giảm dần theo chất lượng thể chế — từ khoảng 55% cường độ xuất khẩu ở các nền kinh tế thể chế yếu xuống khoảng 28% ở các nền kinh tế thể chế mạnh; (2) TCI là năng lực nền tảng nâng mặt bằng hiệu quả phổ quát, trong khi DAI là nguồn lực tình huống làm thay đổi độ cong đường quan hệ và phát huy mạnh hơn ở môi trường thể chế yếu (hiệu ứng</w:t>
+      </w:r>
+      <w:r>
+        <w:t xml:space="preserve"> </w:t>
+      </w:r>
+      <w:r>
+        <w:t xml:space="preserve">“</w:t>
+      </w:r>
+      <w:r>
+        <w:t xml:space="preserve">lá chắn số</w:t>
+      </w:r>
+      <w:r>
+        <w:t xml:space="preserve">”</w:t>
+      </w:r>
+      <w:r>
+        <w:t xml:space="preserve">); (3) tại nhóm SIDS, quan hệ I–P chuyển thành âm đơn điệu không có điểm uốn — hiện tượng được luận án đặt tên là</w:t>
       </w:r>
       <w:r>
         <w:t xml:space="preserve"> </w:t>
@@ -311,8 +327,8 @@
         </w:pict>
       </w:r>
     </w:p>
-    <w:bookmarkEnd w:id="23"/>
-    <w:bookmarkStart w:id="24" w:name="abstract"/>
+    <w:bookmarkEnd w:id="24"/>
+    <w:bookmarkStart w:id="25" w:name="abstract"/>
     <w:p>
       <w:pPr>
         <w:pStyle w:val="Heading2"/>
@@ -342,7 +358,25 @@
         <w:pStyle w:val="BodyText"/>
       </w:pPr>
       <w:r>
-        <w:t xml:space="preserve">Key findings: (1) the I–P relationship is inverted-U shaped, but the turning point is not fixed — it declines with institutional quality, from roughly 55% export intensity in weak-institution economies to about 28% in strong-institution economies; (2) TCI is a foundational capability that universally shifts the performance level, whereas DAI is a situational resource that reshapes the curve and is most effective in weaker institutional environments (a "digital shield" effect); (3) in the SIDS group the relationship becomes monotonically negative with no turning point — a phenomenon the dissertation names the</w:t>
+        <w:t xml:space="preserve">Key findings: (1) the I–P relationship is inverted-U shaped, but the turning point is not fixed — it declines with institutional quality, from roughly 55% export intensity in weak-institution economies to about 28% in strong-institution economies; (2) TCI is a foundational capability that universally shifts the performance level, whereas DAI is a situational resource that reshapes the curve and is most effective in weaker institutional environments (a</w:t>
+      </w:r>
+      <w:r>
+        <w:t xml:space="preserve"> </w:t>
+      </w:r>
+      <w:r>
+        <w:t xml:space="preserve">“</w:t>
+      </w:r>
+      <w:r>
+        <w:t xml:space="preserve">digital shield</w:t>
+      </w:r>
+      <w:r>
+        <w:t xml:space="preserve">”</w:t>
+      </w:r>
+      <w:r>
+        <w:t xml:space="preserve"> </w:t>
+      </w:r>
+      <w:r>
+        <w:t xml:space="preserve">effect); (3) in the SIDS group the relationship becomes monotonically negative with no turning point — a phenomenon the dissertation names the</w:t>
       </w:r>
       <w:r>
         <w:t xml:space="preserve"> </w:t>
@@ -383,8 +417,8 @@
         </w:pict>
       </w:r>
     </w:p>
-    <w:bookmarkEnd w:id="24"/>
-    <w:bookmarkStart w:id="25" w:name="mục-lục"/>
+    <w:bookmarkEnd w:id="25"/>
+    <w:bookmarkStart w:id="26" w:name="mục-lục"/>
     <w:p>
       <w:pPr>
         <w:pStyle w:val="Heading2"/>
@@ -496,8 +530,8 @@
         </w:pict>
       </w:r>
     </w:p>
-    <w:bookmarkEnd w:id="25"/>
-    <w:bookmarkStart w:id="26" w:name="danh-mục-từ-viết-tắt"/>
+    <w:bookmarkEnd w:id="26"/>
+    <w:bookmarkStart w:id="27" w:name="danh-mục-từ-viết-tắt"/>
     <w:p>
       <w:pPr>
         <w:pStyle w:val="Heading2"/>
@@ -509,7 +543,7 @@
     <w:tbl>
       <w:tblPr>
         <w:tblStyle w:val="Table"/>
-        <w:tblW w:type="auto" w:w="0"/>
+        <w:tblW w:type="pct" w:w="5000"/>
         <w:tblLook w:firstRow="1" w:lastRow="0" w:firstColumn="0" w:lastColumn="0" w:noHBand="0" w:noVBand="0" w:val="0020"/>
         <w:jc w:val="start"/>
       </w:tblPr>
@@ -1707,8 +1741,8 @@
         </w:pict>
       </w:r>
     </w:p>
-    <w:bookmarkEnd w:id="26"/>
-    <w:bookmarkStart w:id="27" w:name="danh-mục-bảng"/>
+    <w:bookmarkEnd w:id="27"/>
+    <w:bookmarkStart w:id="28" w:name="danh-mục-bảng"/>
     <w:p>
       <w:pPr>
         <w:pStyle w:val="Heading2"/>
@@ -1723,14 +1757,92 @@
       </w:pPr>
       <w:r>
         <w:rPr>
-          <w:iCs/>
-          <w:i/>
+          <w:bCs/>
+          <w:b/>
         </w:rPr>
-        <w:t xml:space="preserve">(Tự động cập nhật. Ví dụ: Bảng 4.1 — Phân tán năng suất lao động và đặc điểm quốc tế hóa theo phân nhóm con ICRV; Bảng 4.2 — Đổi mới sáng tạo và chấp nhận số theo phân nhóm con ICRV; Bảng định nghĩa biến cho từng nghiên cứu thành phần ở Chương 3; Bảng tổng hợp kết quả theo hệ giả thuyết §4.8.)</w:t>
-      </w:r>
-    </w:p>
-    <w:bookmarkEnd w:id="27"/>
-    <w:bookmarkStart w:id="28" w:name="danh-mục-hình"/>
+        <w:t xml:space="preserve">Bảng đánh số:</w:t>
+      </w:r>
+      <w:r>
+        <w:t xml:space="preserve"> </w:t>
+      </w:r>
+      <w:r>
+        <w:t xml:space="preserve">- Bảng 2.1. Ánh xạ nghiên cứu thành phần — chương — giả thuyết (Chương 2)</w:t>
+      </w:r>
+      <w:r>
+        <w:t xml:space="preserve"> </w:t>
+      </w:r>
+      <w:r>
+        <w:t xml:space="preserve">- Bảng 4.1. Phân tán năng suất lao động và đặc điểm quốc tế hóa theo phân nhóm con ICRV (Chương 4, §4.1)</w:t>
+      </w:r>
+      <w:r>
+        <w:t xml:space="preserve"> </w:t>
+      </w:r>
+      <w:r>
+        <w:t xml:space="preserve">- Bảng 4.2. Đổi mới sáng tạo và chấp nhận số theo phân nhóm con ICRV (%) (Chương 4, §4.1)</w:t>
+      </w:r>
+      <w:r>
+        <w:t xml:space="preserve"> </w:t>
+      </w:r>
+      <w:r>
+        <w:t xml:space="preserve">- Bảng 4.3. Điểm uốn theo đợt khảo sát, Ấn Độ (Chương 4, §4.8)</w:t>
+      </w:r>
+    </w:p>
+    <w:p>
+      <w:pPr>
+        <w:pStyle w:val="BodyText"/>
+      </w:pPr>
+      <w:r>
+        <w:rPr>
+          <w:bCs/>
+          <w:b/>
+        </w:rPr>
+        <w:t xml:space="preserve">Bảng chuyên đề (không đánh số, theo mục):</w:t>
+      </w:r>
+      <w:r>
+        <w:t xml:space="preserve"> </w:t>
+      </w:r>
+      <w:r>
+        <w:t xml:space="preserve">- Bảng định nghĩa biến — Nghiên cứu P3 Việt Nam (Chương 3, §3.4.5.1)</w:t>
+      </w:r>
+      <w:r>
+        <w:t xml:space="preserve"> </w:t>
+      </w:r>
+      <w:r>
+        <w:t xml:space="preserve">- Bảng định nghĩa biến — Nghiên cứu P4 Singapore (Chương 3, §3.4.5.2)</w:t>
+      </w:r>
+      <w:r>
+        <w:t xml:space="preserve"> </w:t>
+      </w:r>
+      <w:r>
+        <w:t xml:space="preserve">- Bảng định nghĩa biến — Nghiên cứu P5 Trung Quốc (Chương 3, §3.4.5.3)</w:t>
+      </w:r>
+      <w:r>
+        <w:t xml:space="preserve"> </w:t>
+      </w:r>
+      <w:r>
+        <w:t xml:space="preserve">- Bảng định nghĩa biến — Nghiên cứu P7 đa quốc gia (Chương 3, §3.4.5.4)</w:t>
+      </w:r>
+      <w:r>
+        <w:t xml:space="preserve"> </w:t>
+      </w:r>
+      <w:r>
+        <w:t xml:space="preserve">- Bảng định nghĩa biến — Nghiên cứu P8 SIDS (Chương 3, §3.4.5.5)</w:t>
+      </w:r>
+      <w:r>
+        <w:t xml:space="preserve"> </w:t>
+      </w:r>
+      <w:r>
+        <w:t xml:space="preserve">- Bảng tóm tắt phương pháp: Kế thừa và đóng góp mới (Chương 3, §3.6)</w:t>
+      </w:r>
+      <w:r>
+        <w:t xml:space="preserve"> </w:t>
+      </w:r>
+      <w:r>
+        <w:t xml:space="preserve">- Bảng tổng hợp kết quả kiểm định hệ giả thuyết H1–H6, H1b, H1c (Chương 4, §4.9)</w:t>
+      </w:r>
+    </w:p>
+    <w:bookmarkEnd w:id="28"/>
+    <w:bookmarkStart w:id="29" w:name="danh-mục-hình"/>
     <w:p>
       <w:pPr>
         <w:pStyle w:val="Heading2"/>
@@ -1748,7 +1860,7 @@
         <w:pStyle w:val="Compact"/>
       </w:pPr>
       <w:r>
-        <w:t xml:space="preserve">Hình 2.1. Khung khái niệm tích hợp đa tầng CDCM (Chương 2)</w:t>
+        <w:t xml:space="preserve">Hình 2.1. Khung khái niệm tích hợp đa tầng CDCM (Chương 2, §2.5)</w:t>
       </w:r>
     </w:p>
     <w:p>
@@ -1760,7 +1872,7 @@
         <w:pStyle w:val="Compact"/>
       </w:pPr>
       <w:r>
-        <w:t xml:space="preserve">Hình 4.x. Họ đường cong I–P phụ thuộc chế độ thể chế ICRV (Chương 4)</w:t>
+        <w:t xml:space="preserve">Hình 4.1. Họ đường cong I–P phụ thuộc chế độ thể chế ICRV (Chương 4)</w:t>
       </w:r>
     </w:p>
     <w:p>
@@ -1772,7 +1884,7 @@
         <w:pStyle w:val="Compact"/>
       </w:pPr>
       <w:r>
-        <w:t xml:space="preserve">Các hình mô tả bổ sung (phân bố pool, mật độ năng suất, v.v.) đặt tại</w:t>
+        <w:t xml:space="preserve">Các hình mô tả bổ sung (phân bố pool theo năm, cơ cấu pool, mật độ năng suất, quy mô doanh nghiệp) lưu tại</w:t>
       </w:r>
       <w:r>
         <w:t xml:space="preserve"> </w:t>
@@ -1794,7 +1906,7 @@
         </w:pict>
       </w:r>
     </w:p>
-    <w:bookmarkEnd w:id="28"/>
+    <w:bookmarkEnd w:id="29"/>
     <w:bookmarkStart w:id="30" w:name="X3131bb7fa4eac4deea1bc52d0a917d3422a5919"/>
     <w:p>
       <w:pPr>
@@ -1881,19 +1993,8 @@
         <w:t xml:space="preserve">International business research: Traditional and creative approaches</w:t>
       </w:r>
       <w:r>
-        <w:t xml:space="preserve">. IntechOpen.</w:t>
-      </w:r>
-      <w:r>
-        <w:t xml:space="preserve"> </w:t>
-      </w:r>
-      <w:hyperlink r:id="rId29">
-        <w:r>
-          <w:rPr>
-            <w:rStyle w:val="Hyperlink"/>
-          </w:rPr>
-          <w:t xml:space="preserve">https://doi.org/10.5772/intechopen.1011012</w:t>
-        </w:r>
-      </w:hyperlink>
+        <w:t xml:space="preserve">. IntechOpen. https://doi.org/10.5772/intechopen.1011012</w:t>
+      </w:r>
       <w:r>
         <w:t xml:space="preserve"> </w:t>
       </w:r>
@@ -1949,7 +2050,7 @@
         <w:pStyle w:val="Compact"/>
       </w:pPr>
       <w:r>
-        <w:t xml:space="preserve">Do, T. H., &amp; Phan, A. T. (2026). Unveiling the impact of Chinese manufacturing SMEs' internationalization on performance.</w:t>
+        <w:t xml:space="preserve">Do, T. H., &amp; Phan, A. T. (2026). Unveiling the impact of Chinese manufacturing SMEs’ internationalization on performance.</w:t>
       </w:r>
       <w:r>
         <w:t xml:space="preserve"> </w:t>
@@ -2177,11 +2278,7 @@
       </w:r>
     </w:p>
     <w:bookmarkEnd w:id="30"/>
-    <w:bookmarkEnd w:id="31"/>
-    <w:sectPr>
-      <w:pgSz w:h="16838" w:w="11906"/>
-      <w:pgMar w:bottom="1134" w:left="1701" w:right="1134" w:top="1134"/>
-    </w:sectPr>
+    <w:sectPr/>
   </w:body>
 </w:document>
 </file>
@@ -2626,59 +2723,29 @@
   <w:style w:default="1" w:styleId="Normal" w:type="paragraph">
     <w:name w:val="Normal"/>
     <w:qFormat/>
-    <w:pPr>
-      <w:spacing w:line="360" w:lineRule="auto"/>
-      <w:jc w:val="both"/>
-    </w:pPr>
-    <w:rPr>
-      <w:rFonts w:ascii="Times New Roman" w:eastAsia="Times New Roman" w:hAnsi="Times New Roman"/>
-      <w:color w:val="000000"/>
-      <w:sz w:val="26"/>
-    </w:rPr>
   </w:style>
   <w:style w:styleId="BodyText" w:type="paragraph">
     <w:name w:val="Body Text"/>
     <w:basedOn w:val="Normal"/>
     <w:link w:val="BodyTextChar"/>
     <w:pPr>
-      <w:spacing w:after="180" w:before="180" w:line="360" w:lineRule="auto"/>
-      <w:jc w:val="both"/>
+      <w:spacing w:after="180" w:before="180"/>
     </w:pPr>
     <w:qFormat/>
-    <w:rPr>
-      <w:rFonts w:ascii="Times New Roman" w:eastAsia="Times New Roman" w:hAnsi="Times New Roman"/>
-      <w:color w:val="000000"/>
-      <w:sz w:val="26"/>
-    </w:rPr>
   </w:style>
   <w:style w:customStyle="1" w:styleId="FirstParagraph" w:type="paragraph">
     <w:name w:val="First Paragraph"/>
     <w:basedOn w:val="BodyText"/>
     <w:next w:val="BodyText"/>
     <w:qFormat/>
-    <w:pPr>
-      <w:spacing w:line="360" w:lineRule="auto"/>
-      <w:jc w:val="both"/>
-    </w:pPr>
-    <w:rPr>
-      <w:rFonts w:ascii="Times New Roman" w:eastAsia="Times New Roman" w:hAnsi="Times New Roman"/>
-      <w:color w:val="000000"/>
-      <w:sz w:val="26"/>
-    </w:rPr>
   </w:style>
   <w:style w:customStyle="1" w:styleId="Compact" w:type="paragraph">
     <w:name w:val="Compact"/>
     <w:basedOn w:val="BodyText"/>
     <w:qFormat/>
     <w:pPr>
-      <w:spacing w:after="36" w:before="36" w:line="360" w:lineRule="auto"/>
-      <w:jc w:val="both"/>
+      <w:spacing w:after="36" w:before="36"/>
     </w:pPr>
-    <w:rPr>
-      <w:rFonts w:ascii="Times New Roman" w:eastAsia="Times New Roman" w:hAnsi="Times New Roman"/>
-      <w:color w:val="000000"/>
-      <w:sz w:val="26"/>
-    </w:rPr>
   </w:style>
   <w:style w:styleId="Title" w:type="paragraph">
     <w:name w:val="Title"/>
@@ -2688,15 +2755,15 @@
     <w:pPr>
       <w:keepNext/>
       <w:keepLines/>
-      <w:spacing w:after="240" w:before="480" w:line="360" w:lineRule="auto"/>
-      <w:jc w:val="both"/>
+      <w:spacing w:after="240" w:before="480"/>
+      <w:jc w:val="center"/>
     </w:pPr>
     <w:rPr>
-      <w:rFonts w:ascii="Times New Roman" w:asciiTheme="majorHAnsi" w:cstheme="majorBidi" w:eastAsia="Times New Roman" w:eastAsiaTheme="majorEastAsia" w:hAnsi="Times New Roman" w:hAnsiTheme="majorHAnsi"/>
+      <w:rFonts w:asciiTheme="majorHAnsi" w:cstheme="majorBidi" w:eastAsiaTheme="majorEastAsia" w:hAnsiTheme="majorHAnsi"/>
       <w:b/>
       <w:bCs/>
-      <w:color w:val="000000"/>
-      <w:sz w:val="26"/>
+      <w:color w:themeColor="accent1" w:themeShade="B5" w:val="345A8A"/>
+      <w:sz w:val="36"/>
       <w:szCs w:val="36"/>
     </w:rPr>
   </w:style>
@@ -2708,13 +2775,11 @@
     <w:pPr>
       <w:keepNext/>
       <w:keepLines/>
-      <w:spacing w:after="240" w:before="240" w:line="360" w:lineRule="auto"/>
-      <w:jc w:val="both"/>
+      <w:spacing w:after="240" w:before="240"/>
+      <w:jc w:val="center"/>
     </w:pPr>
     <w:rPr>
-      <w:rFonts w:ascii="Times New Roman" w:eastAsia="Times New Roman" w:hAnsi="Times New Roman"/>
-      <w:color w:val="000000"/>
-      <w:sz w:val="26"/>
+      <w:sz w:val="30"/>
       <w:szCs w:val="30"/>
     </w:rPr>
   </w:style>
@@ -2725,14 +2790,8 @@
     <w:pPr>
       <w:keepNext/>
       <w:keepLines/>
-      <w:spacing w:line="360" w:lineRule="auto"/>
-      <w:jc w:val="both"/>
+      <w:jc w:val="center"/>
     </w:pPr>
-    <w:rPr>
-      <w:rFonts w:ascii="Times New Roman" w:eastAsia="Times New Roman" w:hAnsi="Times New Roman"/>
-      <w:color w:val="000000"/>
-      <w:sz w:val="26"/>
-    </w:rPr>
   </w:style>
   <w:style w:styleId="Date" w:type="paragraph">
     <w:name w:val="Date"/>
@@ -2741,14 +2800,8 @@
     <w:pPr>
       <w:keepNext/>
       <w:keepLines/>
-      <w:spacing w:line="360" w:lineRule="auto"/>
-      <w:jc w:val="both"/>
+      <w:jc w:val="center"/>
     </w:pPr>
-    <w:rPr>
-      <w:rFonts w:ascii="Times New Roman" w:eastAsia="Times New Roman" w:hAnsi="Times New Roman"/>
-      <w:color w:val="000000"/>
-      <w:sz w:val="26"/>
-    </w:rPr>
   </w:style>
   <w:style w:customStyle="1" w:styleId="AbstractTitle" w:type="paragraph">
     <w:name w:val="Abstract Title"/>
@@ -2758,15 +2811,15 @@
     <w:pPr>
       <w:keepNext/>
       <w:keepLines/>
-      <w:jc w:val="both"/>
-      <w:spacing w:after="0" w:before="300" w:line="360" w:lineRule="auto"/>
+      <w:jc w:val="center"/>
+      <w:spacing w:after="0" w:before="300"/>
     </w:pPr>
     <w:rPr>
-      <w:color w:val="000000"/>
-      <w:sz w:val="26"/>
+      <w:sz w:val="20"/>
       <w:szCs w:val="20"/>
-      <w:rFonts w:ascii="Times New Roman" w:eastAsia="Times New Roman" w:hAnsi="Times New Roman"/>
       <w:b/>
+      <w:color w:val="345A8A"/>
+      &gt;
     </w:rPr>
   </w:style>
   <w:style w:customStyle="1" w:styleId="Abstract" w:type="paragraph">
@@ -2777,13 +2830,10 @@
     <w:pPr>
       <w:keepNext/>
       <w:keepLines/>
-      <w:spacing w:after="300" w:before="100" w:line="360" w:lineRule="auto"/>
-      <w:jc w:val="both"/>
+      <w:spacing w:after="300" w:before="100"/>
     </w:pPr>
     <w:rPr>
-      <w:rFonts w:ascii="Times New Roman" w:eastAsia="Times New Roman" w:hAnsi="Times New Roman"/>
-      <w:color w:val="000000"/>
-      <w:sz w:val="26"/>
+      <w:sz w:val="20"/>
       <w:szCs w:val="20"/>
     </w:rPr>
   </w:style>
@@ -2792,15 +2842,8 @@
     <w:basedOn w:val="Normal"/>
     <w:next w:val="Bibliography"/>
     <w:qFormat/>
-    <w:pPr>
-      <w:spacing w:line="360" w:lineRule="auto"/>
-      <w:jc w:val="both"/>
-    </w:pPr>
-    <w:rPr>
-      <w:rFonts w:ascii="Times New Roman" w:eastAsia="Times New Roman" w:hAnsi="Times New Roman"/>
-      <w:color w:val="000000"/>
-      <w:sz w:val="26"/>
-    </w:rPr>
+    <w:pPr/>
+    <w:rPr/>
   </w:style>
   <w:style w:styleId="Heading1" w:type="paragraph">
     <w:name w:val="Heading 1"/>
@@ -2811,16 +2854,15 @@
     <w:pPr>
       <w:keepNext/>
       <w:keepLines/>
-      <w:spacing w:after="0" w:before="480" w:line="360" w:lineRule="auto"/>
-      <w:jc w:val="both"/>
+      <w:spacing w:after="0" w:before="480"/>
       <w:outlineLvl w:val="0"/>
     </w:pPr>
     <w:rPr>
-      <w:rFonts w:ascii="Times New Roman" w:asciiTheme="majorHAnsi" w:cstheme="majorBidi" w:eastAsia="Times New Roman" w:eastAsiaTheme="majorEastAsia" w:hAnsi="Times New Roman" w:hAnsiTheme="majorHAnsi"/>
+      <w:rFonts w:asciiTheme="majorHAnsi" w:cstheme="majorBidi" w:eastAsiaTheme="majorEastAsia" w:hAnsiTheme="majorHAnsi"/>
       <w:b/>
       <w:bCs/>
-      <w:color w:val="000000"/>
-      <w:sz w:val="26"/>
+      <w:color w:themeColor="accent1" w:val="4F81BD"/>
+      <w:sz w:val="32"/>
       <w:szCs w:val="32"/>
     </w:rPr>
   </w:style>
@@ -2834,16 +2876,15 @@
     <w:pPr>
       <w:keepNext/>
       <w:keepLines/>
-      <w:spacing w:after="0" w:before="200" w:line="360" w:lineRule="auto"/>
-      <w:jc w:val="both"/>
+      <w:spacing w:after="0" w:before="200"/>
       <w:outlineLvl w:val="1"/>
     </w:pPr>
     <w:rPr>
-      <w:rFonts w:ascii="Times New Roman" w:asciiTheme="majorHAnsi" w:cstheme="majorBidi" w:eastAsia="Times New Roman" w:eastAsiaTheme="majorEastAsia" w:hAnsi="Times New Roman" w:hAnsiTheme="majorHAnsi"/>
+      <w:rFonts w:asciiTheme="majorHAnsi" w:cstheme="majorBidi" w:eastAsiaTheme="majorEastAsia" w:hAnsiTheme="majorHAnsi"/>
       <w:b/>
       <w:bCs/>
-      <w:color w:val="000000"/>
-      <w:sz w:val="26"/>
+      <w:color w:themeColor="accent1" w:val="4F81BD"/>
+      <w:sz w:val="28"/>
       <w:szCs w:val="28"/>
     </w:rPr>
   </w:style>
@@ -2857,16 +2898,15 @@
     <w:pPr>
       <w:keepNext/>
       <w:keepLines/>
-      <w:spacing w:after="0" w:before="200" w:line="360" w:lineRule="auto"/>
-      <w:jc w:val="both"/>
+      <w:spacing w:after="0" w:before="200"/>
       <w:outlineLvl w:val="2"/>
     </w:pPr>
     <w:rPr>
-      <w:rFonts w:ascii="Times New Roman" w:asciiTheme="majorHAnsi" w:cstheme="majorBidi" w:eastAsia="Times New Roman" w:eastAsiaTheme="majorEastAsia" w:hAnsi="Times New Roman" w:hAnsiTheme="majorHAnsi"/>
+      <w:rFonts w:asciiTheme="majorHAnsi" w:cstheme="majorBidi" w:eastAsiaTheme="majorEastAsia" w:hAnsiTheme="majorHAnsi"/>
       <w:b/>
       <w:bCs/>
-      <w:color w:val="000000"/>
-      <w:sz w:val="26"/>
+      <w:color w:themeColor="accent1" w:val="4F81BD"/>
+      <w:sz w:val="24"/>
       <w:szCs w:val="24"/>
     </w:rPr>
   </w:style>
@@ -2880,16 +2920,15 @@
     <w:pPr>
       <w:keepNext/>
       <w:keepLines/>
-      <w:spacing w:after="0" w:before="200" w:line="360" w:lineRule="auto"/>
-      <w:jc w:val="both"/>
+      <w:spacing w:after="0" w:before="200"/>
       <w:outlineLvl w:val="3"/>
     </w:pPr>
     <w:rPr>
-      <w:rFonts w:ascii="Times New Roman" w:asciiTheme="majorHAnsi" w:cstheme="majorBidi" w:eastAsia="Times New Roman" w:eastAsiaTheme="majorEastAsia" w:hAnsi="Times New Roman" w:hAnsiTheme="majorHAnsi"/>
+      <w:rFonts w:asciiTheme="majorHAnsi" w:cstheme="majorBidi" w:eastAsiaTheme="majorEastAsia" w:hAnsiTheme="majorHAnsi"/>
       <w:i/>
       <w:bCs/>
-      <w:color w:val="000000"/>
-      <w:sz w:val="26"/>
+      <w:color w:themeColor="accent1" w:val="4F81BD"/>
+      <w:sz w:val="24"/>
       <w:szCs w:val="24"/>
     </w:rPr>
   </w:style>
@@ -2903,15 +2942,14 @@
     <w:pPr>
       <w:keepNext/>
       <w:keepLines/>
-      <w:spacing w:after="0" w:before="200" w:line="360" w:lineRule="auto"/>
-      <w:jc w:val="both"/>
+      <w:spacing w:after="0" w:before="200"/>
       <w:outlineLvl w:val="4"/>
     </w:pPr>
     <w:rPr>
-      <w:rFonts w:ascii="Times New Roman" w:asciiTheme="majorHAnsi" w:cstheme="majorBidi" w:eastAsia="Times New Roman" w:eastAsiaTheme="majorEastAsia" w:hAnsi="Times New Roman" w:hAnsiTheme="majorHAnsi"/>
+      <w:rFonts w:asciiTheme="majorHAnsi" w:cstheme="majorBidi" w:eastAsiaTheme="majorEastAsia" w:hAnsiTheme="majorHAnsi"/>
       <w:iCs/>
-      <w:color w:val="000000"/>
-      <w:sz w:val="26"/>
+      <w:color w:themeColor="accent1" w:val="4F81BD"/>
+      <w:sz w:val="24"/>
       <w:szCs w:val="24"/>
     </w:rPr>
   </w:style>
@@ -2925,14 +2963,13 @@
     <w:pPr>
       <w:keepNext/>
       <w:keepLines/>
-      <w:spacing w:after="0" w:before="200" w:line="360" w:lineRule="auto"/>
-      <w:jc w:val="both"/>
+      <w:spacing w:after="0" w:before="200"/>
       <w:outlineLvl w:val="5"/>
     </w:pPr>
     <w:rPr>
-      <w:rFonts w:ascii="Times New Roman" w:asciiTheme="majorHAnsi" w:cstheme="majorBidi" w:eastAsia="Times New Roman" w:eastAsiaTheme="majorEastAsia" w:hAnsi="Times New Roman" w:hAnsiTheme="majorHAnsi"/>
-      <w:color w:val="000000"/>
-      <w:sz w:val="26"/>
+      <w:rFonts w:asciiTheme="majorHAnsi" w:cstheme="majorBidi" w:eastAsiaTheme="majorEastAsia" w:hAnsiTheme="majorHAnsi"/>
+      <w:color w:themeColor="accent1" w:val="4F81BD"/>
+      <w:sz w:val="24"/>
       <w:szCs w:val="24"/>
     </w:rPr>
   </w:style>
@@ -2946,14 +2983,13 @@
     <w:pPr>
       <w:keepNext/>
       <w:keepLines/>
-      <w:spacing w:after="0" w:before="200" w:line="360" w:lineRule="auto"/>
-      <w:jc w:val="both"/>
+      <w:spacing w:after="0" w:before="200"/>
       <w:outlineLvl w:val="6"/>
     </w:pPr>
     <w:rPr>
-      <w:rFonts w:ascii="Times New Roman" w:asciiTheme="majorHAnsi" w:cstheme="majorBidi" w:eastAsia="Times New Roman" w:eastAsiaTheme="majorEastAsia" w:hAnsi="Times New Roman" w:hAnsiTheme="majorHAnsi"/>
-      <w:color w:val="000000"/>
-      <w:sz w:val="26"/>
+      <w:rFonts w:asciiTheme="majorHAnsi" w:cstheme="majorBidi" w:eastAsiaTheme="majorEastAsia" w:hAnsiTheme="majorHAnsi"/>
+      <w:color w:themeColor="accent1" w:val="4F81BD"/>
+      <w:sz w:val="24"/>
       <w:szCs w:val="24"/>
     </w:rPr>
   </w:style>
@@ -2967,14 +3003,13 @@
     <w:pPr>
       <w:keepNext/>
       <w:keepLines/>
-      <w:spacing w:after="0" w:before="200" w:line="360" w:lineRule="auto"/>
-      <w:jc w:val="both"/>
+      <w:spacing w:after="0" w:before="200"/>
       <w:outlineLvl w:val="7"/>
     </w:pPr>
     <w:rPr>
-      <w:rFonts w:ascii="Times New Roman" w:asciiTheme="majorHAnsi" w:cstheme="majorBidi" w:eastAsia="Times New Roman" w:eastAsiaTheme="majorEastAsia" w:hAnsi="Times New Roman" w:hAnsiTheme="majorHAnsi"/>
-      <w:color w:val="000000"/>
-      <w:sz w:val="26"/>
+      <w:rFonts w:asciiTheme="majorHAnsi" w:cstheme="majorBidi" w:eastAsiaTheme="majorEastAsia" w:hAnsiTheme="majorHAnsi"/>
+      <w:color w:themeColor="accent1" w:val="4F81BD"/>
+      <w:sz w:val="24"/>
       <w:szCs w:val="24"/>
     </w:rPr>
   </w:style>
@@ -2988,14 +3023,13 @@
     <w:pPr>
       <w:keepNext/>
       <w:keepLines/>
-      <w:spacing w:after="0" w:before="200" w:line="360" w:lineRule="auto"/>
-      <w:jc w:val="both"/>
+      <w:spacing w:after="0" w:before="200"/>
       <w:outlineLvl w:val="8"/>
     </w:pPr>
     <w:rPr>
-      <w:rFonts w:ascii="Times New Roman" w:asciiTheme="majorHAnsi" w:cstheme="majorBidi" w:eastAsia="Times New Roman" w:eastAsiaTheme="majorEastAsia" w:hAnsi="Times New Roman" w:hAnsiTheme="majorHAnsi"/>
-      <w:color w:val="000000"/>
-      <w:sz w:val="26"/>
+      <w:rFonts w:asciiTheme="majorHAnsi" w:cstheme="majorBidi" w:eastAsiaTheme="majorEastAsia" w:hAnsiTheme="majorHAnsi"/>
+      <w:color w:themeColor="accent1" w:val="4F81BD"/>
+      <w:sz w:val="24"/>
       <w:szCs w:val="24"/>
     </w:rPr>
   </w:style>
@@ -3007,15 +3041,9 @@
     <w:unhideWhenUsed/>
     <w:qFormat/>
     <w:pPr>
-      <w:spacing w:after="100" w:before="100" w:line="360" w:lineRule="auto"/>
+      <w:spacing w:after="100" w:before="100"/>
       <w:ind w:firstLine="0" w:left="480" w:right="480"/>
-      <w:jc w:val="both"/>
     </w:pPr>
-    <w:rPr>
-      <w:rFonts w:ascii="Times New Roman" w:eastAsia="Times New Roman" w:hAnsi="Times New Roman"/>
-      <w:color w:val="000000"/>
-      <w:sz w:val="26"/>
-    </w:rPr>
   </w:style>
   <w:style w:styleId="FootnoteText" w:type="paragraph">
     <w:name w:val="Footnote Text"/>
@@ -3024,25 +3052,11 @@
     <w:uiPriority w:val="9"/>
     <w:unhideWhenUsed/>
     <w:qFormat/>
-    <w:pPr>
-      <w:spacing w:line="360" w:lineRule="auto"/>
-      <w:jc w:val="both"/>
-    </w:pPr>
-    <w:rPr>
-      <w:rFonts w:ascii="Times New Roman" w:eastAsia="Times New Roman" w:hAnsi="Times New Roman"/>
-      <w:color w:val="000000"/>
-      <w:sz w:val="26"/>
-    </w:rPr>
   </w:style>
   <w:style w:default="1" w:styleId="DefaultParagraphFont" w:type="character">
     <w:name w:val="Default Paragraph Font"/>
     <w:semiHidden/>
     <w:unhideWhenUsed/>
-    <w:rPr>
-      <w:rFonts w:ascii="Times New Roman" w:eastAsia="Times New Roman" w:hAnsi="Times New Roman"/>
-      <w:color w:val="000000"/>
-      <w:sz w:val="26"/>
-    </w:rPr>
   </w:style>
   <w:style w:default="1" w:styleId="Table" w:type="table">
     <w:name w:val="Table"/>
@@ -3050,15 +3064,6 @@
     <w:semiHidden/>
     <w:unhideWhenUsed/>
     <w:qFormat/>
-    <w:pPr>
-      <w:spacing w:line="360" w:lineRule="auto"/>
-      <w:jc w:val="both"/>
-    </w:pPr>
-    <w:rPr>
-      <w:rFonts w:ascii="Times New Roman" w:eastAsia="Times New Roman" w:hAnsi="Times New Roman"/>
-      <w:color w:val="000000"/>
-      <w:sz w:val="26"/>
-    </w:rPr>
     <w:tblPr>
       <w:tblInd w:type="dxa" w:w="0"/>
       <w:tblCellMar>
@@ -3091,42 +3096,25 @@
     <w:pPr>
       <w:keepNext/>
       <w:keepLines/>
-      <w:spacing w:after="0" w:line="360" w:lineRule="auto"/>
-      <w:jc w:val="both"/>
+      <w:spacing w:after="0"/>
     </w:pPr>
     <w:rPr>
-      <w:rFonts w:ascii="Times New Roman" w:eastAsia="Times New Roman" w:hAnsi="Times New Roman"/>
       <w:b/>
-      <w:color w:val="000000"/>
-      <w:sz w:val="26"/>
     </w:rPr>
   </w:style>
   <w:style w:customStyle="1" w:styleId="Definition" w:type="paragraph">
     <w:name w:val="Definition"/>
     <w:basedOn w:val="Normal"/>
-    <w:pPr>
-      <w:spacing w:line="360" w:lineRule="auto"/>
-      <w:jc w:val="both"/>
-    </w:pPr>
-    <w:rPr>
-      <w:rFonts w:ascii="Times New Roman" w:eastAsia="Times New Roman" w:hAnsi="Times New Roman"/>
-      <w:color w:val="000000"/>
-      <w:sz w:val="26"/>
-    </w:rPr>
   </w:style>
   <w:style w:styleId="Caption" w:type="paragraph">
     <w:name w:val="Caption"/>
     <w:basedOn w:val="Normal"/>
     <w:link w:val="BodyTextChar"/>
     <w:pPr>
-      <w:spacing w:after="120" w:before="0" w:line="360" w:lineRule="auto"/>
-      <w:jc w:val="both"/>
+      <w:spacing w:after="120" w:before="0"/>
     </w:pPr>
     <w:rPr>
-      <w:rFonts w:ascii="Times New Roman" w:eastAsia="Times New Roman" w:hAnsi="Times New Roman"/>
       <w:i/>
-      <w:color w:val="000000"/>
-      <w:sz w:val="26"/>
     </w:rPr>
   </w:style>
   <w:style w:customStyle="1" w:styleId="TableCaption" w:type="paragraph">
@@ -3134,90 +3122,44 @@
     <w:basedOn w:val="Caption"/>
     <w:pPr>
       <w:keepNext/>
-      <w:spacing w:line="360" w:lineRule="auto"/>
-      <w:jc w:val="both"/>
     </w:pPr>
-    <w:rPr>
-      <w:rFonts w:ascii="Times New Roman" w:eastAsia="Times New Roman" w:hAnsi="Times New Roman"/>
-      <w:color w:val="000000"/>
-      <w:sz w:val="26"/>
-    </w:rPr>
   </w:style>
   <w:style w:customStyle="1" w:styleId="ImageCaption" w:type="paragraph">
     <w:name w:val="Image Caption"/>
     <w:basedOn w:val="Caption"/>
-    <w:pPr>
-      <w:spacing w:line="360" w:lineRule="auto"/>
-      <w:jc w:val="both"/>
-    </w:pPr>
-    <w:rPr>
-      <w:rFonts w:ascii="Times New Roman" w:eastAsia="Times New Roman" w:hAnsi="Times New Roman"/>
-      <w:color w:val="000000"/>
-      <w:sz w:val="26"/>
-    </w:rPr>
   </w:style>
   <w:style w:customStyle="1" w:styleId="Figure" w:type="paragraph">
     <w:name w:val="Figure"/>
     <w:basedOn w:val="Normal"/>
-    <w:pPr>
-      <w:spacing w:line="360" w:lineRule="auto"/>
-      <w:jc w:val="both"/>
-    </w:pPr>
-    <w:rPr>
-      <w:rFonts w:ascii="Times New Roman" w:eastAsia="Times New Roman" w:hAnsi="Times New Roman"/>
-      <w:color w:val="000000"/>
-      <w:sz w:val="26"/>
-    </w:rPr>
   </w:style>
   <w:style w:customStyle="1" w:styleId="CaptionedFigure" w:type="paragraph">
     <w:name w:val="Captioned Figure"/>
     <w:basedOn w:val="Figure"/>
     <w:pPr>
       <w:keepNext/>
-      <w:spacing w:line="360" w:lineRule="auto"/>
-      <w:jc w:val="both"/>
     </w:pPr>
-    <w:rPr>
-      <w:rFonts w:ascii="Times New Roman" w:eastAsia="Times New Roman" w:hAnsi="Times New Roman"/>
-      <w:color w:val="000000"/>
-      <w:sz w:val="26"/>
-    </w:rPr>
   </w:style>
   <w:style w:customStyle="1" w:styleId="BodyTextChar" w:type="character">
     <w:name w:val="Body Text Char"/>
     <w:basedOn w:val="DefaultParagraphFont"/>
     <w:link w:val="BodyText"/>
-    <w:rPr>
-      <w:rFonts w:ascii="Times New Roman" w:eastAsia="Times New Roman" w:hAnsi="Times New Roman"/>
-      <w:color w:val="000000"/>
-      <w:sz w:val="26"/>
-    </w:rPr>
   </w:style>
   <w:style w:customStyle="1" w:styleId="VerbatimChar" w:type="character">
     <w:name w:val="Verbatim Char"/>
     <w:basedOn w:val="BodyTextChar"/>
     <w:rPr>
-      <w:rFonts w:ascii="Times New Roman" w:eastAsia="Times New Roman" w:hAnsi="Times New Roman"/>
-      <w:color w:val="000000"/>
-      <w:sz w:val="26"/>
+      <w:rFonts w:ascii="Consolas" w:hAnsi="Consolas"/>
+      <w:sz w:val="22"/>
     </w:rPr>
   </w:style>
   <w:style w:customStyle="1" w:styleId="SectionNumber" w:type="character">
     <w:name w:val="Section Number"/>
     <w:basedOn w:val="BodyTextChar"/>
-    <w:rPr>
-      <w:rFonts w:ascii="Times New Roman" w:eastAsia="Times New Roman" w:hAnsi="Times New Roman"/>
-      <w:color w:val="000000"/>
-      <w:sz w:val="26"/>
-    </w:rPr>
   </w:style>
   <w:style w:styleId="FootnoteReference" w:type="character">
     <w:name w:val="Footnote Reference"/>
     <w:basedOn w:val="BodyTextChar"/>
     <w:rPr>
-      <w:rFonts w:ascii="Times New Roman" w:eastAsia="Times New Roman" w:hAnsi="Times New Roman"/>
-      <w:color w:val="000000"/>
-      <w:sz w:val="26"/>
       <w:vertAlign w:val="superscript"/>
     </w:rPr>
   </w:style>
@@ -3225,9 +3167,7 @@
     <w:name w:val="Hyperlink"/>
     <w:basedOn w:val="BodyTextChar"/>
     <w:rPr>
-      <w:rFonts w:ascii="Times New Roman" w:eastAsia="Times New Roman" w:hAnsi="Times New Roman"/>
-      <w:color w:val="000000"/>
-      <w:sz w:val="26"/>
+      <w:color w:themeColor="accent1" w:val="4F81BD"/>
     </w:rPr>
   </w:style>
   <w:style w:styleId="TOCHeading" w:type="paragraph">
@@ -3238,16 +3178,14 @@
     <w:unhideWhenUsed/>
     <w:qFormat/>
     <w:pPr>
-      <w:spacing w:before="240" w:line="360" w:lineRule="auto"/>
-      <w:jc w:val="both"/>
+      <w:spacing w:before="240" w:line="259" w:lineRule="auto"/>
       <w:outlineLvl w:val="9"/>
     </w:pPr>
     <w:rPr>
-      <w:rFonts w:ascii="Times New Roman" w:asciiTheme="majorHAnsi" w:cstheme="majorBidi" w:eastAsia="Times New Roman" w:eastAsiaTheme="majorEastAsia" w:hAnsi="Times New Roman" w:hAnsiTheme="majorHAnsi"/>
+      <w:rFonts w:asciiTheme="majorHAnsi" w:cstheme="majorBidi" w:eastAsiaTheme="majorEastAsia" w:hAnsiTheme="majorHAnsi"/>
       <w:b w:val="0"/>
       <w:bCs w:val="0"/>
-      <w:color w:val="000000"/>
-      <w:sz w:val="26"/>
+      <w:color w:themeColor="accent1" w:themeShade="BF" w:val="365F91"/>
     </w:rPr>
   </w:style>
   <w:style w:type="paragraph" w:customStyle="1" w:styleId="SourceCode">

</xml_diff>

<commit_message>
content(thesis): sync Ch4 Bảng 4.2 to 49-frame raw pipeline; build detailed MỤC LỤC
- Ch4 Bảng 4.2 (innovation/digital by ICRV) re-tabulated from raw WBES 49-frame
  (6 groups; GCC now split out at 6/6) to match CĐ1 Bảng 2.3.4.1 — replaces the
  stale 5-row descriptive-lock numbers. SIDS leapfrog narrative corrected: SIDS
  now leads on product (34.2%) + process (24.7%) innovation; website 41.5% on par
  with Emerging (not the old 58.9% claim). Removed obsolete '43 economies pending'
  note. Linter clean.
- Front matter: replaced placeholder MỤC LỤC with a real detailed table of
  contents (all §x.y headings across 5 chapters + Appendix A). Abbreviations list
  already complete (28 entries) — unchanged.
- Regenerated Ch4 + front-matter docx.
</commit_message>
<xml_diff>
--- a/dist/luan_an_ctu/00_phan_dau_vi.docx
+++ b/dist/luan_an_ctu/00_phan_dau_vi.docx
@@ -433,94 +433,194 @@
       </w:pPr>
       <w:r>
         <w:rPr>
+          <w:bCs/>
+          <w:b/>
+        </w:rPr>
+        <w:t xml:space="preserve">MỞ ĐẦU</w:t>
+      </w:r>
+      <w:r>
+        <w:t xml:space="preserve"> </w:t>
+      </w:r>
+      <w:r>
+        <w:t xml:space="preserve">— Lời cam đoan · Lời cảm ơn · Tóm tắt · Abstract · Danh mục từ viết tắt · Danh mục bảng · Danh mục hình · Danh mục công trình</w:t>
+      </w:r>
+    </w:p>
+    <w:p>
+      <w:pPr>
+        <w:pStyle w:val="BodyText"/>
+      </w:pPr>
+      <w:r>
+        <w:rPr>
+          <w:bCs/>
+          <w:b/>
+        </w:rPr>
+        <w:t xml:space="preserve">CHƯƠNG 1. GIỚI THIỆU</w:t>
+      </w:r>
+      <w:r>
+        <w:t xml:space="preserve"> </w:t>
+      </w:r>
+      <w:r>
+        <w:t xml:space="preserve">- 1.1 Bối cảnh nghiên cứu — 1.2 Vấn đề nghiên cứu — 1.3 Mục tiêu — 1.4 Câu hỏi nghiên cứu</w:t>
+      </w:r>
+      <w:r>
+        <w:t xml:space="preserve"> </w:t>
+      </w:r>
+      <w:r>
+        <w:t xml:space="preserve">- 1.5 Đối tượng và phạm vi — 1.6 Phương pháp luận — 1.7 Giả thuyết khoa học (tóm tắt)</w:t>
+      </w:r>
+      <w:r>
+        <w:t xml:space="preserve"> </w:t>
+      </w:r>
+      <w:r>
+        <w:t xml:space="preserve">- 1.8 Ý nghĩa khoa học và thực tiễn — 1.9 Tính mới — 1.10 Cấu trúc của luận án</w:t>
+      </w:r>
+    </w:p>
+    <w:p>
+      <w:pPr>
+        <w:pStyle w:val="BodyText"/>
+      </w:pPr>
+      <w:r>
+        <w:rPr>
+          <w:bCs/>
+          <w:b/>
+        </w:rPr>
+        <w:t xml:space="preserve">CHƯƠNG 2. CƠ SỞ LÝ THUYẾT VÀ TỔNG QUAN TÀI LIỆU</w:t>
+      </w:r>
+      <w:r>
+        <w:t xml:space="preserve"> </w:t>
+      </w:r>
+      <w:r>
+        <w:t xml:space="preserve">- 2.1 Các khái niệm cốt lõi — 2.2 Các lý thuyết nền — 2.3 Tổng quan thực nghiệm</w:t>
+      </w:r>
+      <w:r>
+        <w:t xml:space="preserve"> </w:t>
+      </w:r>
+      <w:r>
+        <w:t xml:space="preserve">- 2.4 Khoảng trống nghiên cứu — 2.5 Mô hình nghiên cứu và hệ giả thuyết (H1–H6, H1b, H1c) — 2.6 Tóm tắt chương</w:t>
+      </w:r>
+    </w:p>
+    <w:p>
+      <w:pPr>
+        <w:pStyle w:val="BodyText"/>
+      </w:pPr>
+      <w:r>
+        <w:rPr>
+          <w:bCs/>
+          <w:b/>
+        </w:rPr>
+        <w:t xml:space="preserve">CHƯƠNG 3. PHƯƠNG PHÁP NGHIÊN CỨU</w:t>
+      </w:r>
+      <w:r>
+        <w:t xml:space="preserve"> </w:t>
+      </w:r>
+      <w:r>
+        <w:t xml:space="preserve">- 3.1 Thiết kế nghiên cứu tổng thể — 3.2 Phase 1: Meta-analysis 1982–2026 — 3.3 Phase 2: Phân tích thực nghiệm đa quốc gia</w:t>
+      </w:r>
+      <w:r>
+        <w:t xml:space="preserve"> </w:t>
+      </w:r>
+      <w:r>
+        <w:t xml:space="preserve">- 3.4 Mô hình phân tích (M0–M11) — 3.5 Kiểm định độ vững — 3.6 Tóm tắt phương pháp — 3.7 Đạo đức nghiên cứu</w:t>
+      </w:r>
+    </w:p>
+    <w:p>
+      <w:pPr>
+        <w:pStyle w:val="BodyText"/>
+      </w:pPr>
+      <w:r>
+        <w:rPr>
+          <w:bCs/>
+          <w:b/>
+        </w:rPr>
+        <w:t xml:space="preserve">CHƯƠNG 4. KẾT QUẢ NGHIÊN CỨU</w:t>
+      </w:r>
+      <w:r>
+        <w:t xml:space="preserve"> </w:t>
+      </w:r>
+      <w:r>
+        <w:t xml:space="preserve">- 4.1 Thực trạng quốc tế hóa và hiệu quả tại châu Á theo nhóm ICRV</w:t>
+      </w:r>
+      <w:r>
+        <w:t xml:space="preserve"> </w:t>
+      </w:r>
+      <w:r>
+        <w:t xml:space="preserve">- 4.2 Meta-analysis ba tầng (P6) — 4.3 Singapore (P4) — 4.4 Trung Quốc (P5) — 4.5 Việt Nam (P3)</w:t>
+      </w:r>
+      <w:r>
+        <w:t xml:space="preserve"> </w:t>
+      </w:r>
+      <w:r>
+        <w:t xml:space="preserve">- 4.6 Kiểm định toàn mẫu đa bối cảnh (P7) — 4.7 SIDS (P8) — 4.8 Ấn Độ (P9) — 4.9 Tổng hợp theo hệ giả thuyết</w:t>
+      </w:r>
+    </w:p>
+    <w:p>
+      <w:pPr>
+        <w:pStyle w:val="BodyText"/>
+      </w:pPr>
+      <w:r>
+        <w:rPr>
+          <w:bCs/>
+          <w:b/>
+        </w:rPr>
+        <w:t xml:space="preserve">CHƯƠNG 5. THẢO LUẬN VÀ KẾT LUẬN</w:t>
+      </w:r>
+      <w:r>
+        <w:t xml:space="preserve"> </w:t>
+      </w:r>
+      <w:r>
+        <w:t xml:space="preserve">- 5.1 Bàn luận theo khung CDCM — 5.2 So sánh nghiên cứu trước — 5.3 Đóng góp lý thuyết</w:t>
+      </w:r>
+      <w:r>
+        <w:t xml:space="preserve"> </w:t>
+      </w:r>
+      <w:r>
+        <w:t xml:space="preserve">- 5.4 Đề xuất chính sách và quản trị — 5.5 Hạn chế và hướng tương lai — 5.6 Kết luận</w:t>
+      </w:r>
+    </w:p>
+    <w:p>
+      <w:pPr>
+        <w:pStyle w:val="BodyText"/>
+      </w:pPr>
+      <w:r>
+        <w:rPr>
+          <w:bCs/>
+          <w:b/>
+        </w:rPr>
+        <w:t xml:space="preserve">TÀI LIỆU THAM KHẢO</w:t>
+      </w:r>
+      <w:r>
+        <w:t xml:space="preserve"> </w:t>
+      </w:r>
+      <w:r>
+        <w:t xml:space="preserve">(APA 7th)</w:t>
+      </w:r>
+      <w:r>
+        <w:t xml:space="preserve"> </w:t>
+      </w:r>
+      <w:r>
+        <w:rPr>
+          <w:bCs/>
+          <w:b/>
+        </w:rPr>
+        <w:t xml:space="preserve">PHỤ LỤC A</w:t>
+      </w:r>
+      <w:r>
+        <w:t xml:space="preserve"> </w:t>
+      </w:r>
+      <w:r>
+        <w:t xml:space="preserve">— Quy trình hợp nhất và hài hòa hóa dữ liệu WBES đa quốc gia (S1–S6, Hình A.1)</w:t>
+      </w:r>
+    </w:p>
+    <w:p>
+      <w:pPr>
+        <w:pStyle w:val="BodyText"/>
+      </w:pPr>
+      <w:r>
+        <w:rPr>
           <w:iCs/>
           <w:i/>
         </w:rPr>
-        <w:t xml:space="preserve">(Tự động cập nhật khi xuất bản; cấu trúc tóm tắt)</w:t>
-      </w:r>
-    </w:p>
-    <w:p>
-      <w:pPr>
-        <w:numPr>
-          <w:ilvl w:val="0"/>
-          <w:numId w:val="1001"/>
-        </w:numPr>
-        <w:pStyle w:val="Compact"/>
-      </w:pPr>
-      <w:r>
-        <w:t xml:space="preserve">Chương 1. Giới thiệu</w:t>
-      </w:r>
-    </w:p>
-    <w:p>
-      <w:pPr>
-        <w:numPr>
-          <w:ilvl w:val="0"/>
-          <w:numId w:val="1001"/>
-        </w:numPr>
-        <w:pStyle w:val="Compact"/>
-      </w:pPr>
-      <w:r>
-        <w:t xml:space="preserve">Chương 2. Cơ sở lý thuyết và tổng quan tài liệu</w:t>
-      </w:r>
-    </w:p>
-    <w:p>
-      <w:pPr>
-        <w:numPr>
-          <w:ilvl w:val="0"/>
-          <w:numId w:val="1001"/>
-        </w:numPr>
-        <w:pStyle w:val="Compact"/>
-      </w:pPr>
-      <w:r>
-        <w:t xml:space="preserve">Chương 3. Phương pháp nghiên cứu</w:t>
-      </w:r>
-    </w:p>
-    <w:p>
-      <w:pPr>
-        <w:numPr>
-          <w:ilvl w:val="0"/>
-          <w:numId w:val="1001"/>
-        </w:numPr>
-        <w:pStyle w:val="Compact"/>
-      </w:pPr>
-      <w:r>
-        <w:t xml:space="preserve">Chương 4. Kết quả nghiên cứu</w:t>
-      </w:r>
-    </w:p>
-    <w:p>
-      <w:pPr>
-        <w:numPr>
-          <w:ilvl w:val="0"/>
-          <w:numId w:val="1001"/>
-        </w:numPr>
-        <w:pStyle w:val="Compact"/>
-      </w:pPr>
-      <w:r>
-        <w:t xml:space="preserve">Chương 5. Thảo luận và kết luận</w:t>
-      </w:r>
-    </w:p>
-    <w:p>
-      <w:pPr>
-        <w:numPr>
-          <w:ilvl w:val="0"/>
-          <w:numId w:val="1001"/>
-        </w:numPr>
-        <w:pStyle w:val="Compact"/>
-      </w:pPr>
-      <w:r>
-        <w:t xml:space="preserve">Tài liệu tham khảo</w:t>
-      </w:r>
-    </w:p>
-    <w:p>
-      <w:pPr>
-        <w:numPr>
-          <w:ilvl w:val="0"/>
-          <w:numId w:val="1001"/>
-        </w:numPr>
-        <w:pStyle w:val="Compact"/>
-      </w:pPr>
-      <w:r>
-        <w:t xml:space="preserve">Phụ lục</w:t>
+        <w:t xml:space="preserve">(Số trang được sinh tự động khi xuất bản bản cuối.)</w:t>
       </w:r>
     </w:p>
     <w:p>
@@ -1855,12 +1955,85 @@
       <w:pPr>
         <w:numPr>
           <w:ilvl w:val="0"/>
-          <w:numId w:val="1002"/>
+          <w:numId w:val="1001"/>
         </w:numPr>
         <w:pStyle w:val="Compact"/>
       </w:pPr>
       <w:r>
         <w:t xml:space="preserve">Hình 2.1. Khung khái niệm tích hợp đa tầng CDCM (Chương 2, §2.5)</w:t>
+      </w:r>
+    </w:p>
+    <w:p>
+      <w:pPr>
+        <w:numPr>
+          <w:ilvl w:val="0"/>
+          <w:numId w:val="1001"/>
+        </w:numPr>
+        <w:pStyle w:val="Compact"/>
+      </w:pPr>
+      <w:r>
+        <w:t xml:space="preserve">Hình 4.1. Họ đường cong I–P phụ thuộc chế độ thể chế ICRV (Chương 4)</w:t>
+      </w:r>
+    </w:p>
+    <w:p>
+      <w:pPr>
+        <w:numPr>
+          <w:ilvl w:val="0"/>
+          <w:numId w:val="1001"/>
+        </w:numPr>
+        <w:pStyle w:val="Compact"/>
+      </w:pPr>
+      <w:r>
+        <w:t xml:space="preserve">Các hình mô tả bổ sung (phân bố pool theo năm, cơ cấu pool, mật độ năng suất, quy mô doanh nghiệp) lưu tại</w:t>
+      </w:r>
+      <w:r>
+        <w:t xml:space="preserve"> </w:t>
+      </w:r>
+      <w:r>
+        <w:rPr>
+          <w:rStyle w:val="VerbatimChar"/>
+        </w:rPr>
+        <w:t xml:space="preserve">thesis/figures/</w:t>
+      </w:r>
+      <w:r>
+        <w:t xml:space="preserve">.</w:t>
+      </w:r>
+    </w:p>
+    <w:p>
+      <w:r>
+        <w:pict>
+          <v:rect style="width:0;height:1.5pt" o:hralign="center" o:hrstd="t" o:hr="t"/>
+        </w:pict>
+      </w:r>
+    </w:p>
+    <w:bookmarkEnd w:id="29"/>
+    <w:bookmarkStart w:id="30" w:name="X3131bb7fa4eac4deea1bc52d0a917d3422a5919"/>
+    <w:p>
+      <w:pPr>
+        <w:pStyle w:val="Heading2"/>
+      </w:pPr>
+      <w:r>
+        <w:t xml:space="preserve">DANH MỤC CÔNG TRÌNH CỦA NGHIÊN CỨU SINH LIÊN QUAN ĐẾN LUẬN ÁN</w:t>
+      </w:r>
+    </w:p>
+    <w:p>
+      <w:pPr>
+        <w:pStyle w:val="FirstParagraph"/>
+      </w:pPr>
+      <w:r>
+        <w:t xml:space="preserve">Luận án được phát triển gắn với chuỗi nghiên cứu thành phần (ký hiệu nội bộ P1–P9) của nghiên cứu sinh. Các công trình được phân tách rõ theo trạng thái công bố.</w:t>
+      </w:r>
+    </w:p>
+    <w:p>
+      <w:pPr>
+        <w:pStyle w:val="BodyText"/>
+      </w:pPr>
+      <w:r>
+        <w:rPr>
+          <w:bCs/>
+          <w:b/>
+        </w:rPr>
+        <w:t xml:space="preserve">A. Đã công bố (peer-reviewed)</w:t>
       </w:r>
     </w:p>
     <w:p>
@@ -1872,7 +2045,30 @@
         <w:pStyle w:val="Compact"/>
       </w:pPr>
       <w:r>
-        <w:t xml:space="preserve">Hình 4.1. Họ đường cong I–P phụ thuộc chế độ thể chế ICRV (Chương 4)</w:t>
+        <w:t xml:space="preserve">Do, T. H., &amp; Phan, A. T. (2025). Internationalization and firm performance: A meta-analysis review. In</w:t>
+      </w:r>
+      <w:r>
+        <w:t xml:space="preserve"> </w:t>
+      </w:r>
+      <w:r>
+        <w:rPr>
+          <w:iCs/>
+          <w:i/>
+        </w:rPr>
+        <w:t xml:space="preserve">Proceedings of the Sixth International Conference on Sustainable Development in Economics, Business, and Finance (ICBEF 2024)</w:t>
+      </w:r>
+      <w:r>
+        <w:t xml:space="preserve">. Can Tho University, Vietnam.</w:t>
+      </w:r>
+      <w:r>
+        <w:t xml:space="preserve"> </w:t>
+      </w:r>
+      <w:r>
+        <w:rPr>
+          <w:iCs/>
+          <w:i/>
+        </w:rPr>
+        <w:t xml:space="preserve">(Cơ sở baseline meta-analysis — k = 113; nền tảng cho P1/P2/P6.)</w:t>
       </w:r>
     </w:p>
     <w:p>
@@ -1884,56 +2080,112 @@
         <w:pStyle w:val="Compact"/>
       </w:pPr>
       <w:r>
-        <w:t xml:space="preserve">Các hình mô tả bổ sung (phân bố pool theo năm, cơ cấu pool, mật độ năng suất, quy mô doanh nghiệp) lưu tại</w:t>
-      </w:r>
-      <w:r>
-        <w:t xml:space="preserve"> </w:t>
-      </w:r>
-      <w:r>
-        <w:rPr>
-          <w:rStyle w:val="VerbatimChar"/>
-        </w:rPr>
-        <w:t xml:space="preserve">thesis/figures/</w:t>
-      </w:r>
-      <w:r>
-        <w:t xml:space="preserve">.</w:t>
-      </w:r>
-    </w:p>
-    <w:p>
-      <w:r>
-        <w:pict>
-          <v:rect style="width:0;height:1.5pt" o:hralign="center" o:hrstd="t" o:hr="t"/>
-        </w:pict>
-      </w:r>
-    </w:p>
-    <w:bookmarkEnd w:id="29"/>
-    <w:bookmarkStart w:id="30" w:name="X3131bb7fa4eac4deea1bc52d0a917d3422a5919"/>
-    <w:p>
-      <w:pPr>
-        <w:pStyle w:val="Heading2"/>
-      </w:pPr>
-      <w:r>
-        <w:t xml:space="preserve">DANH MỤC CÔNG TRÌNH CỦA NGHIÊN CỨU SINH LIÊN QUAN ĐẾN LUẬN ÁN</w:t>
+        <w:t xml:space="preserve">Do, T. H., &amp; Phan, A. T. (2025). Internationalization and firm performance of firms in India: The role of top management. In M. Bartekova (Ed.),</w:t>
+      </w:r>
+      <w:r>
+        <w:t xml:space="preserve"> </w:t>
+      </w:r>
+      <w:r>
+        <w:rPr>
+          <w:iCs/>
+          <w:i/>
+        </w:rPr>
+        <w:t xml:space="preserve">International business research: Traditional and creative approaches</w:t>
+      </w:r>
+      <w:r>
+        <w:t xml:space="preserve">. IntechOpen. https://doi.org/10.5772/intechopen.1011012</w:t>
+      </w:r>
+      <w:r>
+        <w:t xml:space="preserve"> </w:t>
+      </w:r>
+      <w:r>
+        <w:rPr>
+          <w:iCs/>
+          <w:i/>
+        </w:rPr>
+        <w:t xml:space="preserve">(Công trình tiền đề đã công bố về Ấn Độ — 380 doanh nghiệp WBES, ước lượng FGLS, lăng kính thượng tầng quản trị; được nghiên cứu thành phần P9 trích dẫn như prior author work.)</w:t>
+      </w:r>
+    </w:p>
+    <w:p>
+      <w:pPr>
+        <w:numPr>
+          <w:ilvl w:val="0"/>
+          <w:numId w:val="1002"/>
+        </w:numPr>
+        <w:pStyle w:val="Compact"/>
+      </w:pPr>
+      <w:r>
+        <w:t xml:space="preserve">Do, T. H., &amp; Phan, A. T. (2026). Firm performance heterogeneity in emerging Asia: Evidence from World Bank Enterprise Surveys.</w:t>
+      </w:r>
+      <w:r>
+        <w:t xml:space="preserve"> </w:t>
+      </w:r>
+      <w:r>
+        <w:rPr>
+          <w:iCs/>
+          <w:i/>
+        </w:rPr>
+        <w:t xml:space="preserve">Vietnam Economic &amp; Financial Review, 2</w:t>
+      </w:r>
+      <w:r>
+        <w:t xml:space="preserve">(1), 111–115.</w:t>
+      </w:r>
+      <w:r>
+        <w:t xml:space="preserve"> </w:t>
+      </w:r>
+      <w:r>
+        <w:rPr>
+          <w:iCs/>
+          <w:i/>
+        </w:rPr>
+        <w:t xml:space="preserve">(P1.)</w:t>
+      </w:r>
+    </w:p>
+    <w:p>
+      <w:pPr>
+        <w:numPr>
+          <w:ilvl w:val="0"/>
+          <w:numId w:val="1002"/>
+        </w:numPr>
+        <w:pStyle w:val="Compact"/>
+      </w:pPr>
+      <w:r>
+        <w:t xml:space="preserve">Do, T. H., &amp; Phan, A. T. (2026). Unveiling the impact of Chinese manufacturing SMEs’ internationalization on performance.</w:t>
+      </w:r>
+      <w:r>
+        <w:t xml:space="preserve"> </w:t>
+      </w:r>
+      <w:r>
+        <w:rPr>
+          <w:iCs/>
+          <w:i/>
+        </w:rPr>
+        <w:t xml:space="preserve">Journal of Finance &amp; Accounting Research, 39</w:t>
+      </w:r>
+      <w:r>
+        <w:t xml:space="preserve">(2), 287–291.</w:t>
+      </w:r>
+      <w:r>
+        <w:t xml:space="preserve"> </w:t>
+      </w:r>
+      <w:r>
+        <w:rPr>
+          <w:iCs/>
+          <w:i/>
+        </w:rPr>
+        <w:t xml:space="preserve">(P2.)</w:t>
       </w:r>
     </w:p>
     <w:p>
       <w:pPr>
         <w:pStyle w:val="FirstParagraph"/>
-      </w:pPr>
-      <w:r>
-        <w:t xml:space="preserve">Luận án được phát triển gắn với chuỗi nghiên cứu thành phần (ký hiệu nội bộ P1–P9) của nghiên cứu sinh. Các công trình được phân tách rõ theo trạng thái công bố.</w:t>
-      </w:r>
-    </w:p>
-    <w:p>
-      <w:pPr>
-        <w:pStyle w:val="BodyText"/>
       </w:pPr>
       <w:r>
         <w:rPr>
           <w:bCs/>
           <w:b/>
         </w:rPr>
-        <w:t xml:space="preserve">A. Đã công bố (peer-reviewed)</w:t>
+        <w:t xml:space="preserve">B. Bản thảo đang trong quá trình bình duyệt (CHƯA công bố)</w:t>
       </w:r>
     </w:p>
     <w:p>
@@ -1945,7 +2197,7 @@
         <w:pStyle w:val="Compact"/>
       </w:pPr>
       <w:r>
-        <w:t xml:space="preserve">Do, T. H., &amp; Phan, A. T. (2025). Internationalization and firm performance: A meta-analysis review. In</w:t>
+        <w:t xml:space="preserve">Nghiên cứu thành phần P3 — Việt Nam (bối cảnh chuyển đổi thu nhập trung bình thấp).</w:t>
       </w:r>
       <w:r>
         <w:t xml:space="preserve"> </w:t>
@@ -1955,20 +2207,7 @@
           <w:iCs/>
           <w:i/>
         </w:rPr>
-        <w:t xml:space="preserve">Proceedings of the Sixth International Conference on Sustainable Development in Economics, Business, and Finance (ICBEF 2024)</w:t>
-      </w:r>
-      <w:r>
-        <w:t xml:space="preserve">. Can Tho University, Vietnam.</w:t>
-      </w:r>
-      <w:r>
-        <w:t xml:space="preserve"> </w:t>
-      </w:r>
-      <w:r>
-        <w:rPr>
-          <w:iCs/>
-          <w:i/>
-        </w:rPr>
-        <w:t xml:space="preserve">(Cơ sở baseline meta-analysis — k = 113; nền tảng cho P1/P2/P6.)</w:t>
+        <w:t xml:space="preserve">[Bản thảo đang bình duyệt.]</w:t>
       </w:r>
     </w:p>
     <w:p>
@@ -1980,7 +2219,7 @@
         <w:pStyle w:val="Compact"/>
       </w:pPr>
       <w:r>
-        <w:t xml:space="preserve">Do, T. H., &amp; Phan, A. T. (2025). Internationalization and firm performance of firms in India: The role of top management. In M. Bartekova (Ed.),</w:t>
+        <w:t xml:space="preserve">Nghiên cứu thành phần P4 — Singapore (bối cảnh thể chế tiên tiến–đổi mới).</w:t>
       </w:r>
       <w:r>
         <w:t xml:space="preserve"> </w:t>
@@ -1990,20 +2229,7 @@
           <w:iCs/>
           <w:i/>
         </w:rPr>
-        <w:t xml:space="preserve">International business research: Traditional and creative approaches</w:t>
-      </w:r>
-      <w:r>
-        <w:t xml:space="preserve">. IntechOpen. https://doi.org/10.5772/intechopen.1011012</w:t>
-      </w:r>
-      <w:r>
-        <w:t xml:space="preserve"> </w:t>
-      </w:r>
-      <w:r>
-        <w:rPr>
-          <w:iCs/>
-          <w:i/>
-        </w:rPr>
-        <w:t xml:space="preserve">(Công trình tiền đề đã công bố về Ấn Độ — 380 doanh nghiệp WBES, ước lượng FGLS, lăng kính thượng tầng quản trị; được nghiên cứu thành phần P9 trích dẫn như prior author work.)</w:t>
+        <w:t xml:space="preserve">[Bản thảo đang bình duyệt.]</w:t>
       </w:r>
     </w:p>
     <w:p>
@@ -2015,7 +2241,7 @@
         <w:pStyle w:val="Compact"/>
       </w:pPr>
       <w:r>
-        <w:t xml:space="preserve">Do, T. H., &amp; Phan, A. T. (2026). Firm performance heterogeneity in emerging Asia: Evidence from World Bank Enterprise Surveys.</w:t>
+        <w:t xml:space="preserve">Nghiên cứu thành phần P5 — Trung Quốc 2012–2024 (bối cảnh upper-middle).</w:t>
       </w:r>
       <w:r>
         <w:t xml:space="preserve"> </w:t>
@@ -2025,20 +2251,7 @@
           <w:iCs/>
           <w:i/>
         </w:rPr>
-        <w:t xml:space="preserve">Vietnam Economic &amp; Financial Review, 2</w:t>
-      </w:r>
-      <w:r>
-        <w:t xml:space="preserve">(1), 111–115.</w:t>
-      </w:r>
-      <w:r>
-        <w:t xml:space="preserve"> </w:t>
-      </w:r>
-      <w:r>
-        <w:rPr>
-          <w:iCs/>
-          <w:i/>
-        </w:rPr>
-        <w:t xml:space="preserve">(P1.)</w:t>
+        <w:t xml:space="preserve">[Bản thảo đang bình duyệt.]</w:t>
       </w:r>
     </w:p>
     <w:p>
@@ -2050,7 +2263,7 @@
         <w:pStyle w:val="Compact"/>
       </w:pPr>
       <w:r>
-        <w:t xml:space="preserve">Do, T. H., &amp; Phan, A. T. (2026). Unveiling the impact of Chinese manufacturing SMEs’ internationalization on performance.</w:t>
+        <w:t xml:space="preserve">Nghiên cứu thành phần P6 — Meta-analysis ba tầng mở rộng 1982–2026.</w:t>
       </w:r>
       <w:r>
         <w:t xml:space="preserve"> </w:t>
@@ -2060,10 +2273,19 @@
           <w:iCs/>
           <w:i/>
         </w:rPr>
-        <w:t xml:space="preserve">Journal of Finance &amp; Accounting Research, 39</w:t>
-      </w:r>
-      <w:r>
-        <w:t xml:space="preserve">(2), 287–291.</w:t>
+        <w:t xml:space="preserve">[Bản thảo đang bình duyệt.]</w:t>
+      </w:r>
+    </w:p>
+    <w:p>
+      <w:pPr>
+        <w:numPr>
+          <w:ilvl w:val="0"/>
+          <w:numId w:val="1003"/>
+        </w:numPr>
+        <w:pStyle w:val="Compact"/>
+      </w:pPr>
+      <w:r>
+        <w:t xml:space="preserve">Nghiên cứu thành phần P7 — Kiểm định toàn mẫu 49 nền kinh tế châu Á và Thái Bình Dương (capstone).</w:t>
       </w:r>
       <w:r>
         <w:t xml:space="preserve"> </w:t>
@@ -2073,31 +2295,19 @@
           <w:iCs/>
           <w:i/>
         </w:rPr>
-        <w:t xml:space="preserve">(P2.)</w:t>
-      </w:r>
-    </w:p>
-    <w:p>
-      <w:pPr>
-        <w:pStyle w:val="FirstParagraph"/>
-      </w:pPr>
-      <w:r>
-        <w:rPr>
-          <w:bCs/>
-          <w:b/>
-        </w:rPr>
-        <w:t xml:space="preserve">B. Bản thảo đang trong quá trình bình duyệt (CHƯA công bố)</w:t>
+        <w:t xml:space="preserve">[Bản thảo đang chỉnh sửa theo phản biện.]</w:t>
       </w:r>
     </w:p>
     <w:p>
       <w:pPr>
         <w:numPr>
           <w:ilvl w:val="0"/>
-          <w:numId w:val="1004"/>
+          <w:numId w:val="1003"/>
         </w:numPr>
         <w:pStyle w:val="Compact"/>
       </w:pPr>
       <w:r>
-        <w:t xml:space="preserve">Nghiên cứu thành phần P3 — Việt Nam (bối cảnh chuyển đổi thu nhập trung bình thấp).</w:t>
+        <w:t xml:space="preserve">Nghiên cứu thành phần P8 — Trường hợp biên SIDS, gánh nặng quốc tế hóa bắt buộc (FIP).</w:t>
       </w:r>
       <w:r>
         <w:t xml:space="preserve"> </w:t>
@@ -2107,124 +2317,14 @@
           <w:iCs/>
           <w:i/>
         </w:rPr>
-        <w:t xml:space="preserve">[Bản thảo đang bình duyệt.]</w:t>
+        <w:t xml:space="preserve">[Bản thảo đang chỉnh sửa theo phản biện.]</w:t>
       </w:r>
     </w:p>
     <w:p>
       <w:pPr>
         <w:numPr>
           <w:ilvl w:val="0"/>
-          <w:numId w:val="1004"/>
-        </w:numPr>
-        <w:pStyle w:val="Compact"/>
-      </w:pPr>
-      <w:r>
-        <w:t xml:space="preserve">Nghiên cứu thành phần P4 — Singapore (bối cảnh thể chế tiên tiến–đổi mới).</w:t>
-      </w:r>
-      <w:r>
-        <w:t xml:space="preserve"> </w:t>
-      </w:r>
-      <w:r>
-        <w:rPr>
-          <w:iCs/>
-          <w:i/>
-        </w:rPr>
-        <w:t xml:space="preserve">[Bản thảo đang bình duyệt.]</w:t>
-      </w:r>
-    </w:p>
-    <w:p>
-      <w:pPr>
-        <w:numPr>
-          <w:ilvl w:val="0"/>
-          <w:numId w:val="1004"/>
-        </w:numPr>
-        <w:pStyle w:val="Compact"/>
-      </w:pPr>
-      <w:r>
-        <w:t xml:space="preserve">Nghiên cứu thành phần P5 — Trung Quốc 2012–2024 (bối cảnh upper-middle).</w:t>
-      </w:r>
-      <w:r>
-        <w:t xml:space="preserve"> </w:t>
-      </w:r>
-      <w:r>
-        <w:rPr>
-          <w:iCs/>
-          <w:i/>
-        </w:rPr>
-        <w:t xml:space="preserve">[Bản thảo đang bình duyệt.]</w:t>
-      </w:r>
-    </w:p>
-    <w:p>
-      <w:pPr>
-        <w:numPr>
-          <w:ilvl w:val="0"/>
-          <w:numId w:val="1004"/>
-        </w:numPr>
-        <w:pStyle w:val="Compact"/>
-      </w:pPr>
-      <w:r>
-        <w:t xml:space="preserve">Nghiên cứu thành phần P6 — Meta-analysis ba tầng mở rộng 1982–2026.</w:t>
-      </w:r>
-      <w:r>
-        <w:t xml:space="preserve"> </w:t>
-      </w:r>
-      <w:r>
-        <w:rPr>
-          <w:iCs/>
-          <w:i/>
-        </w:rPr>
-        <w:t xml:space="preserve">[Bản thảo đang bình duyệt.]</w:t>
-      </w:r>
-    </w:p>
-    <w:p>
-      <w:pPr>
-        <w:numPr>
-          <w:ilvl w:val="0"/>
-          <w:numId w:val="1004"/>
-        </w:numPr>
-        <w:pStyle w:val="Compact"/>
-      </w:pPr>
-      <w:r>
-        <w:t xml:space="preserve">Nghiên cứu thành phần P7 — Kiểm định toàn mẫu 49 nền kinh tế châu Á và Thái Bình Dương (capstone).</w:t>
-      </w:r>
-      <w:r>
-        <w:t xml:space="preserve"> </w:t>
-      </w:r>
-      <w:r>
-        <w:rPr>
-          <w:iCs/>
-          <w:i/>
-        </w:rPr>
-        <w:t xml:space="preserve">[Bản thảo đang chỉnh sửa theo phản biện.]</w:t>
-      </w:r>
-    </w:p>
-    <w:p>
-      <w:pPr>
-        <w:numPr>
-          <w:ilvl w:val="0"/>
-          <w:numId w:val="1004"/>
-        </w:numPr>
-        <w:pStyle w:val="Compact"/>
-      </w:pPr>
-      <w:r>
-        <w:t xml:space="preserve">Nghiên cứu thành phần P8 — Trường hợp biên SIDS, gánh nặng quốc tế hóa bắt buộc (FIP).</w:t>
-      </w:r>
-      <w:r>
-        <w:t xml:space="preserve"> </w:t>
-      </w:r>
-      <w:r>
-        <w:rPr>
-          <w:iCs/>
-          <w:i/>
-        </w:rPr>
-        <w:t xml:space="preserve">[Bản thảo đang chỉnh sửa theo phản biện.]</w:t>
-      </w:r>
-    </w:p>
-    <w:p>
-      <w:pPr>
-        <w:numPr>
-          <w:ilvl w:val="0"/>
-          <w:numId w:val="1004"/>
+          <w:numId w:val="1003"/>
         </w:numPr>
         <w:pStyle w:val="Compact"/>
       </w:pPr>
@@ -2637,9 +2737,6 @@
     <w:abstractNumId w:val="991"/>
   </w:num>
   <w:num w:numId="1002">
-    <w:abstractNumId w:val="991"/>
-  </w:num>
-  <w:num w:numId="1003">
     <w:abstractNumId w:val="99411"/>
     <w:lvlOverride w:ilvl="0">
       <w:startOverride w:val="1"/>
@@ -2669,7 +2766,7 @@
       <w:startOverride w:val="1"/>
     </w:lvlOverride>
   </w:num>
-  <w:num w:numId="1004">
+  <w:num w:numId="1003">
     <w:abstractNumId w:val="99415"/>
     <w:lvlOverride w:ilvl="0">
       <w:startOverride w:val="5"/>

</xml_diff>

<commit_message>
build(deliverables): rebuild all stale per-file DOCX + deprecate P7 backups
Comprehensive staleness sweep (158 docx) found many deliverables built
before the Jun-13 source corrections. Fixed:
- ALL per-file dist/luan_an_ctu/*.docx rebuilt from corrected thesis
  sources (00_phan_dau had the OLD 'DAI reshapes the curve' abstract;
  chuong_4, appendix_A_en, references, etc. all refreshed)
- p7/p7_capstone_en_clean.docx + dist/manuscripts/en/p7 rebuilt from the
  reconciled working copy
- P7 jibs_package + apjm_package marked DEPRECATED (IBR is P7's single
  live target; their copies are the superseded 49-econ build)
Verified remaining 84,910/91,982 hits are ONLY in deliberate
'superseded build' provenance notes (P7 banner, appendix A) + the
deprecated backups; all LIVE submission deliverables are canonical-clean.
P6 packages' '49 economies' confirmed = meta coverage (k=238 from 49
economies), correctly retained.
</commit_message>
<xml_diff>
--- a/dist/luan_an_ctu/00_phan_dau_vi.docx
+++ b/dist/luan_an_ctu/00_phan_dau_vi.docx
@@ -271,7 +271,39 @@
         <w:pStyle w:val="BodyText"/>
       </w:pPr>
       <w:r>
-        <w:t xml:space="preserve">Kết quả chính: (1) quan hệ I–P có dạng phi tuyến chữ U ngược với điểm uốn gộp 43,6% (mô hình đầy đủ, 50 nền kinh tế); chữ U ngược định hình rõ nét nhất ở nhóm chuyển đổi thu nhập trung bình–thấp (43,0%), duỗi thẳng gần tuyến tính ở nhóm thể chế mạnh nhất và mất cấu trúc ở các nhóm thể chế yếu nhất; (2) TCI là năng lực nền tảng nâng mặt bằng hiệu quả phổ quát, trong khi DAI là nguồn lực tình huống làm thay đổi độ cong đường quan hệ và phát huy mạnh hơn ở môi trường thể chế yếu (hiệu ứng</w:t>
+        <w:t xml:space="preserve">Kết quả chính: (1) quan hệ I–P có dạng phi tuyến chữ U ngược với điểm uốn gộp 43,6% (mô hình đầy đủ, 50 nền kinh tế); chữ U ngược định hình rõ nét nhất ở nhóm chuyển đổi thu nhập trung bình–thấp (43,0%), duỗi thẳng gần tuyến tính ở nhóm thể chế mạnh nhất và mất cấu trúc ở các nhóm thể chế yếu nhất; (2) cả TCI và DAI đều</w:t>
+      </w:r>
+      <w:r>
+        <w:t xml:space="preserve"> </w:t>
+      </w:r>
+      <w:r>
+        <w:rPr>
+          <w:bCs/>
+          <w:b/>
+        </w:rPr>
+        <w:t xml:space="preserve">nâng mặt bằng hiệu quả một cách phổ quát</w:t>
+      </w:r>
+      <w:r>
+        <w:t xml:space="preserve"> </w:t>
+      </w:r>
+      <w:r>
+        <w:t xml:space="preserve">(TCI là năng lực nền tảng, DAI là nguồn lực tình huống), nhưng vai trò</w:t>
+      </w:r>
+      <w:r>
+        <w:t xml:space="preserve"> </w:t>
+      </w:r>
+      <w:r>
+        <w:rPr>
+          <w:bCs/>
+          <w:b/>
+        </w:rPr>
+        <w:t xml:space="preserve">uốn đường cong</w:t>
+      </w:r>
+      <w:r>
+        <w:t xml:space="preserve"> </w:t>
+      </w:r>
+      <w:r>
+        <w:t xml:space="preserve">của chúng không phổ quát: trên toàn mẫu 50 nền các tương tác với đường cong không đạt ý nghĩa thống kê, và chỉ định hình rõ ở bối cảnh đơn quốc gia đặc thù (điển hình là hiệu ứng</w:t>
       </w:r>
       <w:r>
         <w:t xml:space="preserve"> </w:t>
@@ -286,7 +318,10 @@
         <w:t xml:space="preserve">”</w:t>
       </w:r>
       <w:r>
-        <w:t xml:space="preserve">); (3) tại nhóm SIDS, quan hệ I–P chuyển thành âm đơn điệu không có điểm uốn, hiện tượng được luận án đặt tên là</w:t>
+        <w:t xml:space="preserve"> </w:t>
+      </w:r>
+      <w:r>
+        <w:t xml:space="preserve">của DAI tại Singapore), với xu hướng mạnh hơn ở môi trường thể chế yếu nhưng chỉ ở mức biên ý nghĩa; (3) tại nhóm SIDS, quan hệ I–P chuyển thành âm đơn điệu không có điểm uốn, hiện tượng được luận án đặt tên là</w:t>
       </w:r>
       <w:r>
         <w:t xml:space="preserve"> </w:t>
@@ -358,7 +393,33 @@
         <w:pStyle w:val="BodyText"/>
       </w:pPr>
       <w:r>
-        <w:t xml:space="preserve">Key findings: (1) the I–P relationship is inverted-U shaped with a pooled turning point of 43.6% (full model, 50 economies); the inverted-U is sharpest in the lower-middle transition regime (43.0%), flattens to near-linearity in the strongest-institution regime, and dissolves in the weakest regimes; (2) TCI is a foundational capability that universally shifts the performance level, whereas DAI is a situational resource that reshapes the curve and is most effective in weaker institutional environments (a</w:t>
+        <w:t xml:space="preserve">Key findings: (1) the I–P relationship is inverted-U shaped with a pooled turning point of 43.6% (full model, 50 economies); the inverted-U is sharpest in the lower-middle transition regime (43.0%), flattens to near-linearity in the strongest-institution regime, and dissolves in the weakest regimes; (2) both TCI (a foundational capability) and DAI (a situational resource)</w:t>
+      </w:r>
+      <w:r>
+        <w:t xml:space="preserve"> </w:t>
+      </w:r>
+      <w:r>
+        <w:rPr>
+          <w:bCs/>
+          <w:b/>
+        </w:rPr>
+        <w:t xml:space="preserve">universally shift the performance level</w:t>
+      </w:r>
+      <w:r>
+        <w:t xml:space="preserve">, but their curve-</w:t>
+      </w:r>
+      <w:r>
+        <w:rPr>
+          <w:bCs/>
+          <w:b/>
+        </w:rPr>
+        <w:t xml:space="preserve">reshaping</w:t>
+      </w:r>
+      <w:r>
+        <w:t xml:space="preserve"> </w:t>
+      </w:r>
+      <w:r>
+        <w:t xml:space="preserve">role is not universal: across the 50-economy pool the curvature interactions are not statistically significant, and curve reshaping appears only in specific single-economy contexts (notably DAI’s</w:t>
       </w:r>
       <w:r>
         <w:t xml:space="preserve"> </w:t>
@@ -376,7 +437,7 @@
         <w:t xml:space="preserve"> </w:t>
       </w:r>
       <w:r>
-        <w:t xml:space="preserve">effect); (3) in the SIDS group the relationship becomes monotonically negative with no turning point, a phenomenon the dissertation names the</w:t>
+        <w:t xml:space="preserve">in Singapore), with a tendency toward stronger moderation in weaker institutions that is only marginally significant; (3) in the SIDS group the relationship becomes monotonically negative with no turning point, a phenomenon the dissertation names the</w:t>
       </w:r>
       <w:r>
         <w:t xml:space="preserve"> </w:t>
@@ -2400,14 +2461,67 @@
     </w:p>
     <w:p>
       <w:pPr>
-        <w:pStyle w:val="FirstParagraph"/>
-      </w:pPr>
+        <w:numPr>
+          <w:ilvl w:val="0"/>
+          <w:numId w:val="1003"/>
+        </w:numPr>
+        <w:pStyle w:val="Compact"/>
+      </w:pPr>
+      <w:r>
+        <w:t xml:space="preserve">Nghiên cứu thành phần P11 (sản phẩm phái sinh theo định hướng phát triển), Khoảng cách số tiền-AI và năng suất doanh nghiệp qua các chế độ thể chế châu Á (50 nền WBES): khai thác bằng chứng DAI×ICRV của luận án cho chủ đề AI–phát triển. Đích:</w:t>
+      </w:r>
+      <w:r>
+        <w:t xml:space="preserve"> </w:t>
+      </w:r>
       <w:r>
         <w:rPr>
           <w:iCs/>
           <w:i/>
         </w:rPr>
-        <w:t xml:space="preserve">Ghi chú về liêm chính học thuật: Theo định hướng luận án kết hợp công trình thành phần, các nghiên cứu P1–P9 là một phần nội dung nghiên cứu của chính luận án; do đó trong các chương, chúng được dẫn chiếu bằng nhãn nội bộ (P1–P9) thay vì trích dẫn tác giả–năm. Các bản thảo ở mục B CHƯA được công bố/bình duyệt chính thức, không được diễn giải như bằng chứng đã qua bình duyệt độc lập; tên tạp chí mục tiêu được nêu để minh bạch định hướng công bố; trạng thái bình duyệt sẽ được cập nhật tại thời điểm bảo vệ. NCS cập nhật trạng thái tại thời điểm bảo vệ.</w:t>
+        <w:t xml:space="preserve">Journal of Economics and Development</w:t>
+      </w:r>
+      <w:r>
+        <w:t xml:space="preserve">, số đặc biệt</w:t>
+      </w:r>
+      <w:r>
+        <w:t xml:space="preserve"> </w:t>
+      </w:r>
+      <w:r>
+        <w:t xml:space="preserve">“</w:t>
+      </w:r>
+      <w:r>
+        <w:t xml:space="preserve">Sustainable Growth and Welfare in the Age of AI</w:t>
+      </w:r>
+      <w:r>
+        <w:t xml:space="preserve">”</w:t>
+      </w:r>
+      <w:r>
+        <w:t xml:space="preserve"> </w:t>
+      </w:r>
+      <w:r>
+        <w:t xml:space="preserve">(Emerald; Scopus/ESCI/ABDC; diamond OA, không phí; hạn 31/10/2026).</w:t>
+      </w:r>
+      <w:r>
+        <w:t xml:space="preserve"> </w:t>
+      </w:r>
+      <w:r>
+        <w:rPr>
+          <w:iCs/>
+          <w:i/>
+        </w:rPr>
+        <w:t xml:space="preserve">[Bản thảo chuẩn bị gửi.]</w:t>
+      </w:r>
+    </w:p>
+    <w:p>
+      <w:pPr>
+        <w:pStyle w:val="FirstParagraph"/>
+      </w:pPr>
+      <w:r>
+        <w:rPr>
+          <w:iCs/>
+          <w:i/>
+        </w:rPr>
+        <w:t xml:space="preserve">Ghi chú về liêm chính học thuật: Theo định hướng luận án kết hợp công trình thành phần, các nghiên cứu P1–P11 là một phần nội dung nghiên cứu của chính luận án (P11 là sản phẩm phái sinh theo định hướng phát triển, khai thác lại bằng chứng của luận án); do đó trong các chương, chúng được dẫn chiếu bằng nhãn nội bộ (P1–P10) thay vì trích dẫn tác giả–năm. Các bản thảo ở mục B CHƯA được công bố/bình duyệt chính thức, không được diễn giải như bằng chứng đã qua bình duyệt độc lập; tên tạp chí mục tiêu được nêu để minh bạch định hướng công bố; trạng thái bình duyệt sẽ được cập nhật tại thời điểm bảo vệ. NCS cập nhật trạng thái tại thời điểm bảo vệ.</w:t>
       </w:r>
     </w:p>
     <w:p>

</xml_diff>